<commit_message>
Documento Individual Matias Fase 3
</commit_message>
<xml_diff>
--- a/Fase 3/Evidencias Individuales/Matias_Cuevas_3.1_APT122_DiarioReflexionFase3.docx
+++ b/Fase 3/Evidencias Individuales/Matias_Cuevas_3.1_APT122_DiarioReflexionFase3.docx
@@ -1,6 +1,6 @@
 
 <file path=word/document.xml><?xml version="1.0" encoding="utf-8"?>
-<w:document xmlns:wpc="http://schemas.microsoft.com/office/word/2010/wordprocessingCanvas" xmlns:cx="http://schemas.microsoft.com/office/drawing/2014/chartex" xmlns:mc="http://schemas.openxmlformats.org/markup-compatibility/2006" xmlns:o="urn:schemas-microsoft-com:office:office" xmlns:r="http://schemas.openxmlformats.org/officeDocument/2006/relationships" xmlns:m="http://schemas.openxmlformats.org/officeDocument/2006/math" xmlns:v="urn:schemas-microsoft-com:vml" xmlns:wp14="http://schemas.microsoft.com/office/word/2010/wordprocessingDrawing" xmlns:wp="http://schemas.openxmlformats.org/drawingml/2006/wordprocessingDrawing" xmlns:w10="urn:schemas-microsoft-com:office:word" xmlns:w="http://schemas.openxmlformats.org/wordprocessingml/2006/main" xmlns:w14="http://schemas.microsoft.com/office/word/2010/wordml" xmlns:w15="http://schemas.microsoft.com/office/word/2012/wordml" xmlns:w16se="http://schemas.microsoft.com/office/word/2015/wordml/symex" xmlns:wpg="http://schemas.microsoft.com/office/word/2010/wordprocessingGroup" xmlns:wpi="http://schemas.microsoft.com/office/word/2010/wordprocessingInk" xmlns:wne="http://schemas.microsoft.com/office/word/2006/wordml" xmlns:wps="http://schemas.microsoft.com/office/word/2010/wordprocessingShape" mc:Ignorable="w14 w15 w16se wp14">
+<w:document xmlns:wpc="http://schemas.microsoft.com/office/word/2010/wordprocessingCanvas" xmlns:cx="http://schemas.microsoft.com/office/drawing/2014/chartex" xmlns:cx1="http://schemas.microsoft.com/office/drawing/2015/9/8/chartex" xmlns:cx2="http://schemas.microsoft.com/office/drawing/2015/10/21/chartex" xmlns:cx3="http://schemas.microsoft.com/office/drawing/2016/5/9/chartex" xmlns:cx4="http://schemas.microsoft.com/office/drawing/2016/5/10/chartex" xmlns:cx5="http://schemas.microsoft.com/office/drawing/2016/5/11/chartex" xmlns:cx6="http://schemas.microsoft.com/office/drawing/2016/5/12/chartex" xmlns:cx7="http://schemas.microsoft.com/office/drawing/2016/5/13/chartex" xmlns:cx8="http://schemas.microsoft.com/office/drawing/2016/5/14/chartex" xmlns:mc="http://schemas.openxmlformats.org/markup-compatibility/2006" xmlns:aink="http://schemas.microsoft.com/office/drawing/2016/ink" xmlns:am3d="http://schemas.microsoft.com/office/drawing/2017/model3d" xmlns:o="urn:schemas-microsoft-com:office:office" xmlns:oel="http://schemas.microsoft.com/office/2019/extlst" xmlns:r="http://schemas.openxmlformats.org/officeDocument/2006/relationships" xmlns:m="http://schemas.openxmlformats.org/officeDocument/2006/math" xmlns:v="urn:schemas-microsoft-com:vml" xmlns:wp14="http://schemas.microsoft.com/office/word/2010/wordprocessingDrawing" xmlns:wp="http://schemas.openxmlformats.org/drawingml/2006/wordprocessingDrawing" xmlns:w10="urn:schemas-microsoft-com:office:word" xmlns:w="http://schemas.openxmlformats.org/wordprocessingml/2006/main" xmlns:w14="http://schemas.microsoft.com/office/word/2010/wordml" xmlns:w15="http://schemas.microsoft.com/office/word/2012/wordml" xmlns:w16cex="http://schemas.microsoft.com/office/word/2018/wordml/cex" xmlns:w16cid="http://schemas.microsoft.com/office/word/2016/wordml/cid" xmlns:w16="http://schemas.microsoft.com/office/word/2018/wordml" xmlns:w16du="http://schemas.microsoft.com/office/word/2023/wordml/word16du" xmlns:w16sdtdh="http://schemas.microsoft.com/office/word/2020/wordml/sdtdatahash" xmlns:w16sdtfl="http://schemas.microsoft.com/office/word/2024/wordml/sdtformatlock" xmlns:w16se="http://schemas.microsoft.com/office/word/2015/wordml/symex" xmlns:wpg="http://schemas.microsoft.com/office/word/2010/wordprocessingGroup" xmlns:wpi="http://schemas.microsoft.com/office/word/2010/wordprocessingInk" xmlns:wne="http://schemas.microsoft.com/office/word/2006/wordml" xmlns:wps="http://schemas.microsoft.com/office/word/2010/wordprocessingShape" mc:Ignorable="w14 w15 w16se w16cid w16 w16cex w16sdtdh w16sdtfl w16du wp14">
   <w:body>
     <w:p/>
     <w:tbl>
@@ -373,6 +373,97 @@
                 <w:color w:val="1F4E79" w:themeColor="accent1" w:themeShade="80"/>
               </w:rPr>
             </w:pPr>
+            <w:r>
+              <w:rPr>
+                <w:rFonts w:ascii="Calibri" w:hAnsi="Calibri"/>
+                <w:b/>
+                <w:bCs/>
+                <w:color w:val="1F4E79" w:themeColor="accent1" w:themeShade="80"/>
+              </w:rPr>
+              <w:t>Después de desarrollar mi Proyecto APT, mis intereses profesionales se consolidaron hacia la gestión y liderazgo de proyectos tecnológicos, especialmente aquellos que integran inteligencia artificial y soluciones orientadas a mejorar la experiencia del usuario.</w:t>
+            </w:r>
+          </w:p>
+          <w:p>
+            <w:pPr>
+              <w:jc w:val="both"/>
+              <w:rPr>
+                <w:rFonts w:ascii="Calibri" w:hAnsi="Calibri"/>
+                <w:b/>
+                <w:bCs/>
+                <w:color w:val="1F4E79" w:themeColor="accent1" w:themeShade="80"/>
+              </w:rPr>
+            </w:pPr>
+          </w:p>
+          <w:p>
+            <w:pPr>
+              <w:jc w:val="both"/>
+              <w:rPr>
+                <w:rFonts w:ascii="Calibri" w:hAnsi="Calibri"/>
+                <w:b/>
+                <w:bCs/>
+                <w:color w:val="1F4E79" w:themeColor="accent1" w:themeShade="80"/>
+              </w:rPr>
+            </w:pPr>
+            <w:r>
+              <w:rPr>
+                <w:rFonts w:ascii="Calibri" w:hAnsi="Calibri"/>
+                <w:b/>
+                <w:bCs/>
+                <w:color w:val="1F4E79" w:themeColor="accent1" w:themeShade="80"/>
+              </w:rPr>
+              <w:t xml:space="preserve">Inicialmente mi enfoque estaba más centrado en la programación y el desarrollo técnico, pero a lo largo del proyecto fui valorando la planificación, coordinación y toma de decisiones que implica liderar un equipo. </w:t>
+            </w:r>
+            <w:proofErr w:type="spellStart"/>
+            <w:r>
+              <w:rPr>
+                <w:rFonts w:ascii="Calibri" w:hAnsi="Calibri"/>
+                <w:b/>
+                <w:bCs/>
+                <w:color w:val="1F4E79" w:themeColor="accent1" w:themeShade="80"/>
+              </w:rPr>
+              <w:t>MediTriage</w:t>
+            </w:r>
+            <w:proofErr w:type="spellEnd"/>
+            <w:r>
+              <w:rPr>
+                <w:rFonts w:ascii="Calibri" w:hAnsi="Calibri"/>
+                <w:b/>
+                <w:bCs/>
+                <w:color w:val="1F4E79" w:themeColor="accent1" w:themeShade="80"/>
+              </w:rPr>
+              <w:t xml:space="preserve"> me permitió comprender la importancia del diseño centrado en el usuario y del trabajo interdisciplinario entre tecnología y salud.</w:t>
+            </w:r>
+          </w:p>
+          <w:p>
+            <w:pPr>
+              <w:jc w:val="both"/>
+              <w:rPr>
+                <w:rFonts w:ascii="Calibri" w:hAnsi="Calibri"/>
+                <w:b/>
+                <w:bCs/>
+                <w:color w:val="1F4E79" w:themeColor="accent1" w:themeShade="80"/>
+              </w:rPr>
+            </w:pPr>
+          </w:p>
+          <w:p>
+            <w:pPr>
+              <w:jc w:val="both"/>
+              <w:rPr>
+                <w:rFonts w:ascii="Calibri" w:hAnsi="Calibri"/>
+                <w:b/>
+                <w:bCs/>
+                <w:color w:val="1F4E79" w:themeColor="accent1" w:themeShade="80"/>
+              </w:rPr>
+            </w:pPr>
+            <w:r>
+              <w:rPr>
+                <w:rFonts w:ascii="Calibri" w:hAnsi="Calibri"/>
+                <w:b/>
+                <w:bCs/>
+                <w:color w:val="1F4E79" w:themeColor="accent1" w:themeShade="80"/>
+              </w:rPr>
+              <w:t>El proyecto influyó positivamente en mis intereses, ya que reafirmó mi deseo de seguir perfeccionándome en arquitectura de software, gestión de proyectos y desarrollo de soluciones inteligentes aplicadas al sector salud.</w:t>
+            </w:r>
           </w:p>
           <w:p>
             <w:pPr>
@@ -599,6 +690,109 @@
                 <w:color w:val="1F4E79" w:themeColor="accent1" w:themeShade="80"/>
               </w:rPr>
             </w:pPr>
+            <w:r>
+              <w:rPr>
+                <w:rFonts w:ascii="Calibri" w:hAnsi="Calibri"/>
+                <w:b/>
+                <w:bCs/>
+                <w:color w:val="1F4E79" w:themeColor="accent1" w:themeShade="80"/>
+              </w:rPr>
+              <w:lastRenderedPageBreak/>
+              <w:t>Durante el desarrollo del proyecto, mis fortalezas se consolidaron principalmente en la planificación técnica, la toma de decisiones y la resolución de problemas complejos. Logré mantener una buena organización y liderar el avance del equipo, incluso en etapas críticas.</w:t>
+            </w:r>
+          </w:p>
+          <w:p>
+            <w:pPr>
+              <w:jc w:val="both"/>
+              <w:rPr>
+                <w:rFonts w:ascii="Calibri" w:hAnsi="Calibri"/>
+                <w:b/>
+                <w:bCs/>
+                <w:color w:val="1F4E79" w:themeColor="accent1" w:themeShade="80"/>
+              </w:rPr>
+            </w:pPr>
+          </w:p>
+          <w:p>
+            <w:pPr>
+              <w:jc w:val="both"/>
+              <w:rPr>
+                <w:rFonts w:ascii="Calibri" w:hAnsi="Calibri"/>
+                <w:b/>
+                <w:bCs/>
+                <w:color w:val="1F4E79" w:themeColor="accent1" w:themeShade="80"/>
+              </w:rPr>
+            </w:pPr>
+            <w:r>
+              <w:rPr>
+                <w:rFonts w:ascii="Calibri" w:hAnsi="Calibri"/>
+                <w:b/>
+                <w:bCs/>
+                <w:color w:val="1F4E79" w:themeColor="accent1" w:themeShade="80"/>
+              </w:rPr>
+              <w:t>Mis debilidades iniciales estaban relacionadas con la gestión del tiempo personal y la comunicación técnica con el equipo, especialmente al coordinar múltiples tareas simultáneamente.</w:t>
+            </w:r>
+          </w:p>
+          <w:p>
+            <w:pPr>
+              <w:jc w:val="both"/>
+              <w:rPr>
+                <w:rFonts w:ascii="Calibri" w:hAnsi="Calibri"/>
+                <w:b/>
+                <w:bCs/>
+                <w:color w:val="1F4E79" w:themeColor="accent1" w:themeShade="80"/>
+              </w:rPr>
+            </w:pPr>
+          </w:p>
+          <w:p>
+            <w:pPr>
+              <w:jc w:val="both"/>
+              <w:rPr>
+                <w:rFonts w:ascii="Calibri" w:hAnsi="Calibri"/>
+                <w:b/>
+                <w:bCs/>
+                <w:color w:val="1F4E79" w:themeColor="accent1" w:themeShade="80"/>
+              </w:rPr>
+            </w:pPr>
+            <w:r>
+              <w:rPr>
+                <w:rFonts w:ascii="Calibri" w:hAnsi="Calibri"/>
+                <w:b/>
+                <w:bCs/>
+                <w:color w:val="1F4E79" w:themeColor="accent1" w:themeShade="80"/>
+              </w:rPr>
+              <w:t>Hoy, esas debilidades han mejorado, pero aún son áreas de crecimiento. Planeo seguir fortaleciéndome mediante el uso de herramientas de gestión (como Jira o Trello) y continuar perfeccionando mis habilidades de comunicación y liderazgo en equipos multidisciplinarios.</w:t>
+            </w:r>
+          </w:p>
+          <w:p>
+            <w:pPr>
+              <w:jc w:val="both"/>
+              <w:rPr>
+                <w:rFonts w:ascii="Calibri" w:hAnsi="Calibri"/>
+                <w:b/>
+                <w:bCs/>
+                <w:color w:val="1F4E79" w:themeColor="accent1" w:themeShade="80"/>
+              </w:rPr>
+            </w:pPr>
+          </w:p>
+          <w:p>
+            <w:pPr>
+              <w:jc w:val="both"/>
+              <w:rPr>
+                <w:rFonts w:ascii="Calibri" w:hAnsi="Calibri"/>
+                <w:b/>
+                <w:bCs/>
+                <w:color w:val="1F4E79" w:themeColor="accent1" w:themeShade="80"/>
+              </w:rPr>
+            </w:pPr>
+            <w:r>
+              <w:rPr>
+                <w:rFonts w:ascii="Calibri" w:hAnsi="Calibri"/>
+                <w:b/>
+                <w:bCs/>
+                <w:color w:val="1F4E79" w:themeColor="accent1" w:themeShade="80"/>
+              </w:rPr>
+              <w:t>Para potenciar mis fortalezas, seguiré asumiendo roles de liderazgo técnico en proyectos y buscando certificaciones relacionadas con la gestión y dirección de proyectos (como PMI o Scrum Master).</w:t>
+            </w:r>
           </w:p>
           <w:p>
             <w:pPr>
@@ -738,15 +932,12 @@
                 <w:szCs w:val="24"/>
               </w:rPr>
             </w:pPr>
-            <w:bookmarkStart w:id="0" w:name="_GoBack"/>
-            <w:bookmarkEnd w:id="0"/>
             <w:r>
               <w:rPr>
                 <w:rFonts w:eastAsiaTheme="majorEastAsia"/>
                 <w:sz w:val="24"/>
                 <w:szCs w:val="24"/>
               </w:rPr>
-              <w:lastRenderedPageBreak/>
               <w:t>3. Mira la pregunta 3 de la Pauta de Reflexión de la Fase I que describe tus proyecciones laborales al inicio de la asignatura y responde:</w:t>
             </w:r>
           </w:p>
@@ -844,6 +1035,66 @@
                 <w:color w:val="1F4E79" w:themeColor="accent1" w:themeShade="80"/>
               </w:rPr>
             </w:pPr>
+            <w:r>
+              <w:rPr>
+                <w:rFonts w:ascii="Calibri" w:hAnsi="Calibri"/>
+                <w:b/>
+                <w:bCs/>
+                <w:color w:val="1F4E79" w:themeColor="accent1" w:themeShade="80"/>
+              </w:rPr>
+              <w:t xml:space="preserve">Mis proyecciones laborales evolucionaron luego del APT. Al inicio, me veía principalmente como desarrollador </w:t>
+            </w:r>
+            <w:proofErr w:type="spellStart"/>
+            <w:r>
+              <w:rPr>
+                <w:rFonts w:ascii="Calibri" w:hAnsi="Calibri"/>
+                <w:b/>
+                <w:bCs/>
+                <w:color w:val="1F4E79" w:themeColor="accent1" w:themeShade="80"/>
+              </w:rPr>
+              <w:t>backend</w:t>
+            </w:r>
+            <w:proofErr w:type="spellEnd"/>
+            <w:r>
+              <w:rPr>
+                <w:rFonts w:ascii="Calibri" w:hAnsi="Calibri"/>
+                <w:b/>
+                <w:bCs/>
+                <w:color w:val="1F4E79" w:themeColor="accent1" w:themeShade="80"/>
+              </w:rPr>
+              <w:t>, pero ahora me proyecto como líder técnico o jefe de proyectos, con una visión integral del proceso de desarrollo y del impacto real que las soluciones digitales pueden tener.</w:t>
+            </w:r>
+          </w:p>
+          <w:p>
+            <w:pPr>
+              <w:jc w:val="both"/>
+              <w:rPr>
+                <w:rFonts w:ascii="Calibri" w:hAnsi="Calibri"/>
+                <w:b/>
+                <w:bCs/>
+                <w:color w:val="1F4E79" w:themeColor="accent1" w:themeShade="80"/>
+              </w:rPr>
+            </w:pPr>
+          </w:p>
+          <w:p>
+            <w:pPr>
+              <w:jc w:val="both"/>
+              <w:rPr>
+                <w:rFonts w:ascii="Calibri" w:hAnsi="Calibri"/>
+                <w:b/>
+                <w:bCs/>
+                <w:color w:val="1F4E79" w:themeColor="accent1" w:themeShade="80"/>
+              </w:rPr>
+            </w:pPr>
+            <w:r>
+              <w:rPr>
+                <w:rFonts w:ascii="Calibri" w:hAnsi="Calibri"/>
+                <w:b/>
+                <w:bCs/>
+                <w:color w:val="1F4E79" w:themeColor="accent1" w:themeShade="80"/>
+              </w:rPr>
+              <w:t>En cinco años me imagino trabajando en una empresa tecnológica o de servicios financieros/salud, liderando proyectos de innovación que involucren IA, automatización y experiencia de usuario. También me gustaría participar en la toma de decisiones estratégicas que definan la dirección tecnológica de una organización.</w:t>
+            </w:r>
           </w:p>
           <w:p>
             <w:pPr>
@@ -981,6 +1232,7 @@
                 <w:sz w:val="24"/>
                 <w:szCs w:val="24"/>
               </w:rPr>
+              <w:lastRenderedPageBreak/>
               <w:t>¿Qué aspectos positivos y negativos identificas del trabajo en grupo realizado en esta asignatura?</w:t>
             </w:r>
           </w:p>
@@ -1032,6 +1284,63 @@
                 <w:szCs w:val="24"/>
               </w:rPr>
             </w:pPr>
+            <w:r>
+              <w:rPr>
+                <w:sz w:val="24"/>
+                <w:szCs w:val="24"/>
+              </w:rPr>
+              <w:t>El trabajo en grupo fue una experiencia muy enriquecedora. Como aspecto positivo destaco la colaboración constante y la capacidad de adaptarnos a los desafíos técnicos y de tiempo. La comunicación entre los integrantes fue clave para mantener la coherencia y cumplir los plazos.</w:t>
+            </w:r>
+          </w:p>
+          <w:p>
+            <w:pPr>
+              <w:jc w:val="both"/>
+              <w:rPr>
+                <w:sz w:val="24"/>
+                <w:szCs w:val="24"/>
+              </w:rPr>
+            </w:pPr>
+          </w:p>
+          <w:p>
+            <w:pPr>
+              <w:jc w:val="both"/>
+              <w:rPr>
+                <w:sz w:val="24"/>
+                <w:szCs w:val="24"/>
+              </w:rPr>
+            </w:pPr>
+            <w:r>
+              <w:rPr>
+                <w:sz w:val="24"/>
+                <w:szCs w:val="24"/>
+              </w:rPr>
+              <w:t>Entre los aspectos negativos, en algunos momentos se presentaron dificultades para coordinar los tiempos individuales, ya que cada miembro tenía responsabilidades externas. Sin embargo, esto se compensó con una buena planificación y redistribución de tareas.</w:t>
+            </w:r>
+          </w:p>
+          <w:p>
+            <w:pPr>
+              <w:jc w:val="both"/>
+              <w:rPr>
+                <w:sz w:val="24"/>
+                <w:szCs w:val="24"/>
+              </w:rPr>
+            </w:pPr>
+          </w:p>
+          <w:p>
+            <w:pPr>
+              <w:jc w:val="both"/>
+              <w:rPr>
+                <w:sz w:val="24"/>
+                <w:szCs w:val="24"/>
+              </w:rPr>
+            </w:pPr>
+            <w:r>
+              <w:rPr>
+                <w:sz w:val="24"/>
+                <w:szCs w:val="24"/>
+              </w:rPr>
+              <w:t>Para mejorar en futuros trabajos, debo potenciar la delegación efectiva y el seguimiento de tareas, además de fomentar instancias de retroalimentación continua que mantengan la motivación y alineación del equipo.</w:t>
+            </w:r>
           </w:p>
           <w:p>
             <w:pPr>
@@ -1126,7 +1435,7 @@
 </file>
 
 <file path=word/endnotes.xml><?xml version="1.0" encoding="utf-8"?>
-<w:endnotes xmlns:wpc="http://schemas.microsoft.com/office/word/2010/wordprocessingCanvas" xmlns:cx="http://schemas.microsoft.com/office/drawing/2014/chartex" xmlns:mc="http://schemas.openxmlformats.org/markup-compatibility/2006" xmlns:o="urn:schemas-microsoft-com:office:office" xmlns:r="http://schemas.openxmlformats.org/officeDocument/2006/relationships" xmlns:m="http://schemas.openxmlformats.org/officeDocument/2006/math" xmlns:v="urn:schemas-microsoft-com:vml" xmlns:wp14="http://schemas.microsoft.com/office/word/2010/wordprocessingDrawing" xmlns:wp="http://schemas.openxmlformats.org/drawingml/2006/wordprocessingDrawing" xmlns:w10="urn:schemas-microsoft-com:office:word" xmlns:w="http://schemas.openxmlformats.org/wordprocessingml/2006/main" xmlns:w14="http://schemas.microsoft.com/office/word/2010/wordml" xmlns:w15="http://schemas.microsoft.com/office/word/2012/wordml" xmlns:w16se="http://schemas.microsoft.com/office/word/2015/wordml/symex" xmlns:wpg="http://schemas.microsoft.com/office/word/2010/wordprocessingGroup" xmlns:wpi="http://schemas.microsoft.com/office/word/2010/wordprocessingInk" xmlns:wne="http://schemas.microsoft.com/office/word/2006/wordml" xmlns:wps="http://schemas.microsoft.com/office/word/2010/wordprocessingShape" mc:Ignorable="w14 w15 w16se wp14">
+<w:endnotes xmlns:wpc="http://schemas.microsoft.com/office/word/2010/wordprocessingCanvas" xmlns:cx="http://schemas.microsoft.com/office/drawing/2014/chartex" xmlns:cx1="http://schemas.microsoft.com/office/drawing/2015/9/8/chartex" xmlns:cx2="http://schemas.microsoft.com/office/drawing/2015/10/21/chartex" xmlns:cx3="http://schemas.microsoft.com/office/drawing/2016/5/9/chartex" xmlns:cx4="http://schemas.microsoft.com/office/drawing/2016/5/10/chartex" xmlns:cx5="http://schemas.microsoft.com/office/drawing/2016/5/11/chartex" xmlns:cx6="http://schemas.microsoft.com/office/drawing/2016/5/12/chartex" xmlns:cx7="http://schemas.microsoft.com/office/drawing/2016/5/13/chartex" xmlns:cx8="http://schemas.microsoft.com/office/drawing/2016/5/14/chartex" xmlns:mc="http://schemas.openxmlformats.org/markup-compatibility/2006" xmlns:aink="http://schemas.microsoft.com/office/drawing/2016/ink" xmlns:am3d="http://schemas.microsoft.com/office/drawing/2017/model3d" xmlns:o="urn:schemas-microsoft-com:office:office" xmlns:oel="http://schemas.microsoft.com/office/2019/extlst" xmlns:r="http://schemas.openxmlformats.org/officeDocument/2006/relationships" xmlns:m="http://schemas.openxmlformats.org/officeDocument/2006/math" xmlns:v="urn:schemas-microsoft-com:vml" xmlns:wp14="http://schemas.microsoft.com/office/word/2010/wordprocessingDrawing" xmlns:wp="http://schemas.openxmlformats.org/drawingml/2006/wordprocessingDrawing" xmlns:w10="urn:schemas-microsoft-com:office:word" xmlns:w="http://schemas.openxmlformats.org/wordprocessingml/2006/main" xmlns:w14="http://schemas.microsoft.com/office/word/2010/wordml" xmlns:w15="http://schemas.microsoft.com/office/word/2012/wordml" xmlns:w16cex="http://schemas.microsoft.com/office/word/2018/wordml/cex" xmlns:w16cid="http://schemas.microsoft.com/office/word/2016/wordml/cid" xmlns:w16="http://schemas.microsoft.com/office/word/2018/wordml" xmlns:w16du="http://schemas.microsoft.com/office/word/2023/wordml/word16du" xmlns:w16sdtdh="http://schemas.microsoft.com/office/word/2020/wordml/sdtdatahash" xmlns:w16sdtfl="http://schemas.microsoft.com/office/word/2024/wordml/sdtformatlock" xmlns:w16se="http://schemas.microsoft.com/office/word/2015/wordml/symex" xmlns:wpg="http://schemas.microsoft.com/office/word/2010/wordprocessingGroup" xmlns:wpi="http://schemas.microsoft.com/office/word/2010/wordprocessingInk" xmlns:wne="http://schemas.microsoft.com/office/word/2006/wordml" xmlns:wps="http://schemas.microsoft.com/office/word/2010/wordprocessingShape" mc:Ignorable="w14 w15 w16se w16cid w16 w16cex w16sdtdh w16sdtfl w16du wp14">
   <w:endnote w:type="separator" w:id="-1">
     <w:p>
       <w:pPr>
@@ -1151,7 +1460,7 @@
 </file>
 
 <file path=word/footer1.xml><?xml version="1.0" encoding="utf-8"?>
-<w:ftr xmlns:wpc="http://schemas.microsoft.com/office/word/2010/wordprocessingCanvas" xmlns:cx="http://schemas.microsoft.com/office/drawing/2014/chartex" xmlns:mc="http://schemas.openxmlformats.org/markup-compatibility/2006" xmlns:o="urn:schemas-microsoft-com:office:office" xmlns:r="http://schemas.openxmlformats.org/officeDocument/2006/relationships" xmlns:m="http://schemas.openxmlformats.org/officeDocument/2006/math" xmlns:v="urn:schemas-microsoft-com:vml" xmlns:wp14="http://schemas.microsoft.com/office/word/2010/wordprocessingDrawing" xmlns:wp="http://schemas.openxmlformats.org/drawingml/2006/wordprocessingDrawing" xmlns:w10="urn:schemas-microsoft-com:office:word" xmlns:w="http://schemas.openxmlformats.org/wordprocessingml/2006/main" xmlns:w14="http://schemas.microsoft.com/office/word/2010/wordml" xmlns:w15="http://schemas.microsoft.com/office/word/2012/wordml" xmlns:w16se="http://schemas.microsoft.com/office/word/2015/wordml/symex" xmlns:wpg="http://schemas.microsoft.com/office/word/2010/wordprocessingGroup" xmlns:wpi="http://schemas.microsoft.com/office/word/2010/wordprocessingInk" xmlns:wne="http://schemas.microsoft.com/office/word/2006/wordml" xmlns:wps="http://schemas.microsoft.com/office/word/2010/wordprocessingShape" mc:Ignorable="w14 w15 w16se wp14">
+<w:ftr xmlns:wpc="http://schemas.microsoft.com/office/word/2010/wordprocessingCanvas" xmlns:cx="http://schemas.microsoft.com/office/drawing/2014/chartex" xmlns:cx1="http://schemas.microsoft.com/office/drawing/2015/9/8/chartex" xmlns:cx2="http://schemas.microsoft.com/office/drawing/2015/10/21/chartex" xmlns:cx3="http://schemas.microsoft.com/office/drawing/2016/5/9/chartex" xmlns:cx4="http://schemas.microsoft.com/office/drawing/2016/5/10/chartex" xmlns:cx5="http://schemas.microsoft.com/office/drawing/2016/5/11/chartex" xmlns:cx6="http://schemas.microsoft.com/office/drawing/2016/5/12/chartex" xmlns:cx7="http://schemas.microsoft.com/office/drawing/2016/5/13/chartex" xmlns:cx8="http://schemas.microsoft.com/office/drawing/2016/5/14/chartex" xmlns:mc="http://schemas.openxmlformats.org/markup-compatibility/2006" xmlns:aink="http://schemas.microsoft.com/office/drawing/2016/ink" xmlns:am3d="http://schemas.microsoft.com/office/drawing/2017/model3d" xmlns:o="urn:schemas-microsoft-com:office:office" xmlns:oel="http://schemas.microsoft.com/office/2019/extlst" xmlns:r="http://schemas.openxmlformats.org/officeDocument/2006/relationships" xmlns:m="http://schemas.openxmlformats.org/officeDocument/2006/math" xmlns:v="urn:schemas-microsoft-com:vml" xmlns:wp14="http://schemas.microsoft.com/office/word/2010/wordprocessingDrawing" xmlns:wp="http://schemas.openxmlformats.org/drawingml/2006/wordprocessingDrawing" xmlns:w10="urn:schemas-microsoft-com:office:word" xmlns:w="http://schemas.openxmlformats.org/wordprocessingml/2006/main" xmlns:w14="http://schemas.microsoft.com/office/word/2010/wordml" xmlns:w15="http://schemas.microsoft.com/office/word/2012/wordml" xmlns:w16cex="http://schemas.microsoft.com/office/word/2018/wordml/cex" xmlns:w16cid="http://schemas.microsoft.com/office/word/2016/wordml/cid" xmlns:w16="http://schemas.microsoft.com/office/word/2018/wordml" xmlns:w16du="http://schemas.microsoft.com/office/word/2023/wordml/word16du" xmlns:w16sdtdh="http://schemas.microsoft.com/office/word/2020/wordml/sdtdatahash" xmlns:w16sdtfl="http://schemas.microsoft.com/office/word/2024/wordml/sdtformatlock" xmlns:w16se="http://schemas.microsoft.com/office/word/2015/wordml/symex" xmlns:wpg="http://schemas.microsoft.com/office/word/2010/wordprocessingGroup" xmlns:wpi="http://schemas.microsoft.com/office/word/2010/wordprocessingInk" xmlns:wne="http://schemas.microsoft.com/office/word/2006/wordml" xmlns:wps="http://schemas.microsoft.com/office/word/2010/wordprocessingShape" mc:Ignorable="w14 w15 w16se w16cid w16 w16cex w16sdtdh w16sdtfl w16du wp14">
   <w:sdt>
     <w:sdtPr>
       <w:id w:val="-937982979"/>
@@ -1160,7 +1469,6 @@
         <w:docPartUnique/>
       </w:docPartObj>
     </w:sdtPr>
-    <w:sdtEndPr/>
     <w:sdtContent>
       <w:p>
         <w:pPr>
@@ -1372,7 +1680,7 @@
             </mc:Choice>
             <mc:Fallback>
               <w:pict>
-                <v:group w14:anchorId="51D00065" id="Grupo 32" o:spid="_x0000_s1026" style="position:absolute;margin-left:0;margin-top:0;width:610.5pt;height:15pt;z-index:251659264;mso-width-percent:1000;mso-position-horizontal:center;mso-position-horizontal-relative:page;mso-position-vertical:center;mso-position-vertical-relative:bottom-margin-area;mso-width-percent:1000" coordorigin=",14970" coordsize="12255,300" o:gfxdata="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">
+                <v:group w14:anchorId="51D00065" id="Grupo 32" o:spid="_x0000_s1026" style="position:absolute;margin-left:0;margin-top:0;width:610.5pt;height:15pt;z-index:251659264;mso-width-percent:1000;mso-position-horizontal:center;mso-position-horizontal-relative:page;mso-position-vertical:center;mso-position-vertical-relative:bottom-margin-area;mso-width-percent:1000" coordorigin=",14970" coordsize="12255,300" o:gfxdata="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">
                   <v:shapetype id="_x0000_t202" coordsize="21600,21600" o:spt="202" path="m,l,21600r21600,l21600,xe">
                     <v:stroke joinstyle="miter"/>
                     <v:path gradientshapeok="t" o:connecttype="rect"/>
@@ -1439,7 +1747,7 @@
 </file>
 
 <file path=word/footnotes.xml><?xml version="1.0" encoding="utf-8"?>
-<w:footnotes xmlns:wpc="http://schemas.microsoft.com/office/word/2010/wordprocessingCanvas" xmlns:cx="http://schemas.microsoft.com/office/drawing/2014/chartex" xmlns:mc="http://schemas.openxmlformats.org/markup-compatibility/2006" xmlns:o="urn:schemas-microsoft-com:office:office" xmlns:r="http://schemas.openxmlformats.org/officeDocument/2006/relationships" xmlns:m="http://schemas.openxmlformats.org/officeDocument/2006/math" xmlns:v="urn:schemas-microsoft-com:vml" xmlns:wp14="http://schemas.microsoft.com/office/word/2010/wordprocessingDrawing" xmlns:wp="http://schemas.openxmlformats.org/drawingml/2006/wordprocessingDrawing" xmlns:w10="urn:schemas-microsoft-com:office:word" xmlns:w="http://schemas.openxmlformats.org/wordprocessingml/2006/main" xmlns:w14="http://schemas.microsoft.com/office/word/2010/wordml" xmlns:w15="http://schemas.microsoft.com/office/word/2012/wordml" xmlns:w16se="http://schemas.microsoft.com/office/word/2015/wordml/symex" xmlns:wpg="http://schemas.microsoft.com/office/word/2010/wordprocessingGroup" xmlns:wpi="http://schemas.microsoft.com/office/word/2010/wordprocessingInk" xmlns:wne="http://schemas.microsoft.com/office/word/2006/wordml" xmlns:wps="http://schemas.microsoft.com/office/word/2010/wordprocessingShape" mc:Ignorable="w14 w15 w16se wp14">
+<w:footnotes xmlns:wpc="http://schemas.microsoft.com/office/word/2010/wordprocessingCanvas" xmlns:cx="http://schemas.microsoft.com/office/drawing/2014/chartex" xmlns:cx1="http://schemas.microsoft.com/office/drawing/2015/9/8/chartex" xmlns:cx2="http://schemas.microsoft.com/office/drawing/2015/10/21/chartex" xmlns:cx3="http://schemas.microsoft.com/office/drawing/2016/5/9/chartex" xmlns:cx4="http://schemas.microsoft.com/office/drawing/2016/5/10/chartex" xmlns:cx5="http://schemas.microsoft.com/office/drawing/2016/5/11/chartex" xmlns:cx6="http://schemas.microsoft.com/office/drawing/2016/5/12/chartex" xmlns:cx7="http://schemas.microsoft.com/office/drawing/2016/5/13/chartex" xmlns:cx8="http://schemas.microsoft.com/office/drawing/2016/5/14/chartex" xmlns:mc="http://schemas.openxmlformats.org/markup-compatibility/2006" xmlns:aink="http://schemas.microsoft.com/office/drawing/2016/ink" xmlns:am3d="http://schemas.microsoft.com/office/drawing/2017/model3d" xmlns:o="urn:schemas-microsoft-com:office:office" xmlns:oel="http://schemas.microsoft.com/office/2019/extlst" xmlns:r="http://schemas.openxmlformats.org/officeDocument/2006/relationships" xmlns:m="http://schemas.openxmlformats.org/officeDocument/2006/math" xmlns:v="urn:schemas-microsoft-com:vml" xmlns:wp14="http://schemas.microsoft.com/office/word/2010/wordprocessingDrawing" xmlns:wp="http://schemas.openxmlformats.org/drawingml/2006/wordprocessingDrawing" xmlns:w10="urn:schemas-microsoft-com:office:word" xmlns:w="http://schemas.openxmlformats.org/wordprocessingml/2006/main" xmlns:w14="http://schemas.microsoft.com/office/word/2010/wordml" xmlns:w15="http://schemas.microsoft.com/office/word/2012/wordml" xmlns:w16cex="http://schemas.microsoft.com/office/word/2018/wordml/cex" xmlns:w16cid="http://schemas.microsoft.com/office/word/2016/wordml/cid" xmlns:w16="http://schemas.microsoft.com/office/word/2018/wordml" xmlns:w16du="http://schemas.microsoft.com/office/word/2023/wordml/word16du" xmlns:w16sdtdh="http://schemas.microsoft.com/office/word/2020/wordml/sdtdatahash" xmlns:w16sdtfl="http://schemas.microsoft.com/office/word/2024/wordml/sdtformatlock" xmlns:w16se="http://schemas.microsoft.com/office/word/2015/wordml/symex" xmlns:wpg="http://schemas.microsoft.com/office/word/2010/wordprocessingGroup" xmlns:wpi="http://schemas.microsoft.com/office/word/2010/wordprocessingInk" xmlns:wne="http://schemas.microsoft.com/office/word/2006/wordml" xmlns:wps="http://schemas.microsoft.com/office/word/2010/wordprocessingShape" mc:Ignorable="w14 w15 w16se w16cid w16 w16cex w16sdtdh w16sdtfl w16du wp14">
   <w:footnote w:type="separator" w:id="-1">
     <w:p>
       <w:pPr>
@@ -1464,7 +1772,7 @@
 </file>
 
 <file path=word/header1.xml><?xml version="1.0" encoding="utf-8"?>
-<w:hdr xmlns:wpc="http://schemas.microsoft.com/office/word/2010/wordprocessingCanvas" xmlns:cx="http://schemas.microsoft.com/office/drawing/2014/chartex" xmlns:mc="http://schemas.openxmlformats.org/markup-compatibility/2006" xmlns:o="urn:schemas-microsoft-com:office:office" xmlns:r="http://schemas.openxmlformats.org/officeDocument/2006/relationships" xmlns:m="http://schemas.openxmlformats.org/officeDocument/2006/math" xmlns:v="urn:schemas-microsoft-com:vml" xmlns:wp14="http://schemas.microsoft.com/office/word/2010/wordprocessingDrawing" xmlns:wp="http://schemas.openxmlformats.org/drawingml/2006/wordprocessingDrawing" xmlns:w10="urn:schemas-microsoft-com:office:word" xmlns:w="http://schemas.openxmlformats.org/wordprocessingml/2006/main" xmlns:w14="http://schemas.microsoft.com/office/word/2010/wordml" xmlns:w15="http://schemas.microsoft.com/office/word/2012/wordml" xmlns:w16se="http://schemas.microsoft.com/office/word/2015/wordml/symex" xmlns:wpg="http://schemas.microsoft.com/office/word/2010/wordprocessingGroup" xmlns:wpi="http://schemas.microsoft.com/office/word/2010/wordprocessingInk" xmlns:wne="http://schemas.microsoft.com/office/word/2006/wordml" xmlns:wps="http://schemas.microsoft.com/office/word/2010/wordprocessingShape" mc:Ignorable="w14 w15 w16se wp14">
+<w:hdr xmlns:wpc="http://schemas.microsoft.com/office/word/2010/wordprocessingCanvas" xmlns:cx="http://schemas.microsoft.com/office/drawing/2014/chartex" xmlns:cx1="http://schemas.microsoft.com/office/drawing/2015/9/8/chartex" xmlns:cx2="http://schemas.microsoft.com/office/drawing/2015/10/21/chartex" xmlns:cx3="http://schemas.microsoft.com/office/drawing/2016/5/9/chartex" xmlns:cx4="http://schemas.microsoft.com/office/drawing/2016/5/10/chartex" xmlns:cx5="http://schemas.microsoft.com/office/drawing/2016/5/11/chartex" xmlns:cx6="http://schemas.microsoft.com/office/drawing/2016/5/12/chartex" xmlns:cx7="http://schemas.microsoft.com/office/drawing/2016/5/13/chartex" xmlns:cx8="http://schemas.microsoft.com/office/drawing/2016/5/14/chartex" xmlns:mc="http://schemas.openxmlformats.org/markup-compatibility/2006" xmlns:aink="http://schemas.microsoft.com/office/drawing/2016/ink" xmlns:am3d="http://schemas.microsoft.com/office/drawing/2017/model3d" xmlns:o="urn:schemas-microsoft-com:office:office" xmlns:oel="http://schemas.microsoft.com/office/2019/extlst" xmlns:r="http://schemas.openxmlformats.org/officeDocument/2006/relationships" xmlns:m="http://schemas.openxmlformats.org/officeDocument/2006/math" xmlns:v="urn:schemas-microsoft-com:vml" xmlns:wp14="http://schemas.microsoft.com/office/word/2010/wordprocessingDrawing" xmlns:wp="http://schemas.openxmlformats.org/drawingml/2006/wordprocessingDrawing" xmlns:w10="urn:schemas-microsoft-com:office:word" xmlns:w="http://schemas.openxmlformats.org/wordprocessingml/2006/main" xmlns:w14="http://schemas.microsoft.com/office/word/2010/wordml" xmlns:w15="http://schemas.microsoft.com/office/word/2012/wordml" xmlns:w16cex="http://schemas.microsoft.com/office/word/2018/wordml/cex" xmlns:w16cid="http://schemas.microsoft.com/office/word/2016/wordml/cid" xmlns:w16="http://schemas.microsoft.com/office/word/2018/wordml" xmlns:w16du="http://schemas.microsoft.com/office/word/2023/wordml/word16du" xmlns:w16sdtdh="http://schemas.microsoft.com/office/word/2020/wordml/sdtdatahash" xmlns:w16sdtfl="http://schemas.microsoft.com/office/word/2024/wordml/sdtformatlock" xmlns:w16se="http://schemas.microsoft.com/office/word/2015/wordml/symex" xmlns:wpg="http://schemas.microsoft.com/office/word/2010/wordprocessingGroup" xmlns:wpi="http://schemas.microsoft.com/office/word/2010/wordprocessingInk" xmlns:wne="http://schemas.microsoft.com/office/word/2006/wordml" xmlns:wps="http://schemas.microsoft.com/office/word/2010/wordprocessingShape" mc:Ignorable="w14 w15 w16se w16cid w16 w16cex w16sdtdh w16sdtfl w16du wp14">
   <w:tbl>
     <w:tblPr>
       <w:tblStyle w:val="Tablaconcuadrcula"/>
@@ -1634,7 +1942,7 @@
 </file>
 
 <file path=word/header2.xml><?xml version="1.0" encoding="utf-8"?>
-<w:hdr xmlns:wpc="http://schemas.microsoft.com/office/word/2010/wordprocessingCanvas" xmlns:cx="http://schemas.microsoft.com/office/drawing/2014/chartex" xmlns:mc="http://schemas.openxmlformats.org/markup-compatibility/2006" xmlns:o="urn:schemas-microsoft-com:office:office" xmlns:r="http://schemas.openxmlformats.org/officeDocument/2006/relationships" xmlns:m="http://schemas.openxmlformats.org/officeDocument/2006/math" xmlns:v="urn:schemas-microsoft-com:vml" xmlns:wp14="http://schemas.microsoft.com/office/word/2010/wordprocessingDrawing" xmlns:wp="http://schemas.openxmlformats.org/drawingml/2006/wordprocessingDrawing" xmlns:w10="urn:schemas-microsoft-com:office:word" xmlns:w="http://schemas.openxmlformats.org/wordprocessingml/2006/main" xmlns:w14="http://schemas.microsoft.com/office/word/2010/wordml" xmlns:w15="http://schemas.microsoft.com/office/word/2012/wordml" xmlns:w16se="http://schemas.microsoft.com/office/word/2015/wordml/symex" xmlns:wpg="http://schemas.microsoft.com/office/word/2010/wordprocessingGroup" xmlns:wpi="http://schemas.microsoft.com/office/word/2010/wordprocessingInk" xmlns:wne="http://schemas.microsoft.com/office/word/2006/wordml" xmlns:wps="http://schemas.microsoft.com/office/word/2010/wordprocessingShape" mc:Ignorable="w14 w15 w16se wp14">
+<w:hdr xmlns:wpc="http://schemas.microsoft.com/office/word/2010/wordprocessingCanvas" xmlns:cx="http://schemas.microsoft.com/office/drawing/2014/chartex" xmlns:cx1="http://schemas.microsoft.com/office/drawing/2015/9/8/chartex" xmlns:cx2="http://schemas.microsoft.com/office/drawing/2015/10/21/chartex" xmlns:cx3="http://schemas.microsoft.com/office/drawing/2016/5/9/chartex" xmlns:cx4="http://schemas.microsoft.com/office/drawing/2016/5/10/chartex" xmlns:cx5="http://schemas.microsoft.com/office/drawing/2016/5/11/chartex" xmlns:cx6="http://schemas.microsoft.com/office/drawing/2016/5/12/chartex" xmlns:cx7="http://schemas.microsoft.com/office/drawing/2016/5/13/chartex" xmlns:cx8="http://schemas.microsoft.com/office/drawing/2016/5/14/chartex" xmlns:mc="http://schemas.openxmlformats.org/markup-compatibility/2006" xmlns:aink="http://schemas.microsoft.com/office/drawing/2016/ink" xmlns:am3d="http://schemas.microsoft.com/office/drawing/2017/model3d" xmlns:o="urn:schemas-microsoft-com:office:office" xmlns:oel="http://schemas.microsoft.com/office/2019/extlst" xmlns:r="http://schemas.openxmlformats.org/officeDocument/2006/relationships" xmlns:m="http://schemas.openxmlformats.org/officeDocument/2006/math" xmlns:v="urn:schemas-microsoft-com:vml" xmlns:wp14="http://schemas.microsoft.com/office/word/2010/wordprocessingDrawing" xmlns:wp="http://schemas.openxmlformats.org/drawingml/2006/wordprocessingDrawing" xmlns:w10="urn:schemas-microsoft-com:office:word" xmlns:w="http://schemas.openxmlformats.org/wordprocessingml/2006/main" xmlns:w14="http://schemas.microsoft.com/office/word/2010/wordml" xmlns:w15="http://schemas.microsoft.com/office/word/2012/wordml" xmlns:w16cex="http://schemas.microsoft.com/office/word/2018/wordml/cex" xmlns:w16cid="http://schemas.microsoft.com/office/word/2016/wordml/cid" xmlns:w16="http://schemas.microsoft.com/office/word/2018/wordml" xmlns:w16du="http://schemas.microsoft.com/office/word/2023/wordml/word16du" xmlns:w16sdtdh="http://schemas.microsoft.com/office/word/2020/wordml/sdtdatahash" xmlns:w16sdtfl="http://schemas.microsoft.com/office/word/2024/wordml/sdtformatlock" xmlns:w16se="http://schemas.microsoft.com/office/word/2015/wordml/symex" xmlns:wpg="http://schemas.microsoft.com/office/word/2010/wordprocessingGroup" xmlns:wpi="http://schemas.microsoft.com/office/word/2010/wordprocessingInk" xmlns:wne="http://schemas.microsoft.com/office/word/2006/wordml" xmlns:wps="http://schemas.microsoft.com/office/word/2010/wordprocessingShape" mc:Ignorable="w14 w15 w16se w16cid w16 w16cex w16sdtdh w16sdtfl w16du wp14">
   <w:tbl>
     <w:tblPr>
       <w:tblStyle w:val="Tablaconcuadrcula"/>
@@ -1917,7 +2225,7 @@
 </file>
 
 <file path=word/numbering.xml><?xml version="1.0" encoding="utf-8"?>
-<w:numbering xmlns:wpc="http://schemas.microsoft.com/office/word/2010/wordprocessingCanvas" xmlns:cx="http://schemas.microsoft.com/office/drawing/2014/chartex" xmlns:mc="http://schemas.openxmlformats.org/markup-compatibility/2006" xmlns:o="urn:schemas-microsoft-com:office:office" xmlns:r="http://schemas.openxmlformats.org/officeDocument/2006/relationships" xmlns:m="http://schemas.openxmlformats.org/officeDocument/2006/math" xmlns:v="urn:schemas-microsoft-com:vml" xmlns:wp14="http://schemas.microsoft.com/office/word/2010/wordprocessingDrawing" xmlns:wp="http://schemas.openxmlformats.org/drawingml/2006/wordprocessingDrawing" xmlns:w10="urn:schemas-microsoft-com:office:word" xmlns:w="http://schemas.openxmlformats.org/wordprocessingml/2006/main" xmlns:w14="http://schemas.microsoft.com/office/word/2010/wordml" xmlns:w15="http://schemas.microsoft.com/office/word/2012/wordml" xmlns:w16se="http://schemas.microsoft.com/office/word/2015/wordml/symex" xmlns:wpg="http://schemas.microsoft.com/office/word/2010/wordprocessingGroup" xmlns:wpi="http://schemas.microsoft.com/office/word/2010/wordprocessingInk" xmlns:wne="http://schemas.microsoft.com/office/word/2006/wordml" xmlns:wps="http://schemas.microsoft.com/office/word/2010/wordprocessingShape" mc:Ignorable="w14 w15 w16se wp14">
+<w:numbering xmlns:wpc="http://schemas.microsoft.com/office/word/2010/wordprocessingCanvas" xmlns:cx="http://schemas.microsoft.com/office/drawing/2014/chartex" xmlns:cx1="http://schemas.microsoft.com/office/drawing/2015/9/8/chartex" xmlns:cx2="http://schemas.microsoft.com/office/drawing/2015/10/21/chartex" xmlns:cx3="http://schemas.microsoft.com/office/drawing/2016/5/9/chartex" xmlns:cx4="http://schemas.microsoft.com/office/drawing/2016/5/10/chartex" xmlns:cx5="http://schemas.microsoft.com/office/drawing/2016/5/11/chartex" xmlns:cx6="http://schemas.microsoft.com/office/drawing/2016/5/12/chartex" xmlns:cx7="http://schemas.microsoft.com/office/drawing/2016/5/13/chartex" xmlns:cx8="http://schemas.microsoft.com/office/drawing/2016/5/14/chartex" xmlns:mc="http://schemas.openxmlformats.org/markup-compatibility/2006" xmlns:aink="http://schemas.microsoft.com/office/drawing/2016/ink" xmlns:am3d="http://schemas.microsoft.com/office/drawing/2017/model3d" xmlns:o="urn:schemas-microsoft-com:office:office" xmlns:oel="http://schemas.microsoft.com/office/2019/extlst" xmlns:r="http://schemas.openxmlformats.org/officeDocument/2006/relationships" xmlns:m="http://schemas.openxmlformats.org/officeDocument/2006/math" xmlns:v="urn:schemas-microsoft-com:vml" xmlns:wp14="http://schemas.microsoft.com/office/word/2010/wordprocessingDrawing" xmlns:wp="http://schemas.openxmlformats.org/drawingml/2006/wordprocessingDrawing" xmlns:w10="urn:schemas-microsoft-com:office:word" xmlns:w="http://schemas.openxmlformats.org/wordprocessingml/2006/main" xmlns:w14="http://schemas.microsoft.com/office/word/2010/wordml" xmlns:w15="http://schemas.microsoft.com/office/word/2012/wordml" xmlns:w16cex="http://schemas.microsoft.com/office/word/2018/wordml/cex" xmlns:w16cid="http://schemas.microsoft.com/office/word/2016/wordml/cid" xmlns:w16="http://schemas.microsoft.com/office/word/2018/wordml" xmlns:w16du="http://schemas.microsoft.com/office/word/2023/wordml/word16du" xmlns:w16sdtdh="http://schemas.microsoft.com/office/word/2020/wordml/sdtdatahash" xmlns:w16sdtfl="http://schemas.microsoft.com/office/word/2024/wordml/sdtformatlock" xmlns:w16se="http://schemas.microsoft.com/office/word/2015/wordml/symex" xmlns:wpg="http://schemas.microsoft.com/office/word/2010/wordprocessingGroup" xmlns:wpi="http://schemas.microsoft.com/office/word/2010/wordprocessingInk" xmlns:wne="http://schemas.microsoft.com/office/word/2006/wordml" xmlns:wps="http://schemas.microsoft.com/office/word/2010/wordprocessingShape" mc:Ignorable="w14 w15 w16se w16cid w16 w16cex w16sdtdh w16sdtfl w16du wp14">
   <w:abstractNum w:abstractNumId="0" w15:restartNumberingAfterBreak="0">
     <w:nsid w:val="049156A1"/>
     <w:multiLevelType w:val="hybridMultilevel"/>
@@ -6491,124 +6799,124 @@
       </w:rPr>
     </w:lvl>
   </w:abstractNum>
-  <w:num w:numId="1">
+  <w:num w:numId="1" w16cid:durableId="978387496">
     <w:abstractNumId w:val="3"/>
   </w:num>
-  <w:num w:numId="2">
+  <w:num w:numId="2" w16cid:durableId="1068066662">
     <w:abstractNumId w:val="8"/>
   </w:num>
-  <w:num w:numId="3">
+  <w:num w:numId="3" w16cid:durableId="1327048161">
     <w:abstractNumId w:val="12"/>
   </w:num>
-  <w:num w:numId="4">
+  <w:num w:numId="4" w16cid:durableId="709451126">
     <w:abstractNumId w:val="28"/>
   </w:num>
-  <w:num w:numId="5">
+  <w:num w:numId="5" w16cid:durableId="1586037347">
     <w:abstractNumId w:val="30"/>
   </w:num>
-  <w:num w:numId="6">
+  <w:num w:numId="6" w16cid:durableId="973872272">
     <w:abstractNumId w:val="4"/>
   </w:num>
-  <w:num w:numId="7">
+  <w:num w:numId="7" w16cid:durableId="1461073572">
     <w:abstractNumId w:val="11"/>
   </w:num>
-  <w:num w:numId="8">
+  <w:num w:numId="8" w16cid:durableId="1728802033">
     <w:abstractNumId w:val="19"/>
   </w:num>
-  <w:num w:numId="9">
+  <w:num w:numId="9" w16cid:durableId="2035763507">
     <w:abstractNumId w:val="15"/>
   </w:num>
-  <w:num w:numId="10">
+  <w:num w:numId="10" w16cid:durableId="2016763207">
     <w:abstractNumId w:val="9"/>
   </w:num>
-  <w:num w:numId="11">
+  <w:num w:numId="11" w16cid:durableId="629433389">
     <w:abstractNumId w:val="24"/>
   </w:num>
-  <w:num w:numId="12">
+  <w:num w:numId="12" w16cid:durableId="1743063836">
     <w:abstractNumId w:val="35"/>
   </w:num>
-  <w:num w:numId="13">
+  <w:num w:numId="13" w16cid:durableId="1600984572">
     <w:abstractNumId w:val="29"/>
   </w:num>
-  <w:num w:numId="14">
+  <w:num w:numId="14" w16cid:durableId="1662387402">
     <w:abstractNumId w:val="1"/>
   </w:num>
-  <w:num w:numId="15">
+  <w:num w:numId="15" w16cid:durableId="1185247191">
     <w:abstractNumId w:val="36"/>
   </w:num>
-  <w:num w:numId="16">
+  <w:num w:numId="16" w16cid:durableId="1805153310">
     <w:abstractNumId w:val="21"/>
   </w:num>
-  <w:num w:numId="17">
+  <w:num w:numId="17" w16cid:durableId="77757682">
     <w:abstractNumId w:val="17"/>
   </w:num>
-  <w:num w:numId="18">
+  <w:num w:numId="18" w16cid:durableId="1715160020">
     <w:abstractNumId w:val="31"/>
   </w:num>
-  <w:num w:numId="19">
+  <w:num w:numId="19" w16cid:durableId="1267928772">
     <w:abstractNumId w:val="10"/>
   </w:num>
-  <w:num w:numId="20">
+  <w:num w:numId="20" w16cid:durableId="636179701">
     <w:abstractNumId w:val="39"/>
   </w:num>
-  <w:num w:numId="21">
+  <w:num w:numId="21" w16cid:durableId="1910192944">
     <w:abstractNumId w:val="34"/>
   </w:num>
-  <w:num w:numId="22">
+  <w:num w:numId="22" w16cid:durableId="867991037">
     <w:abstractNumId w:val="13"/>
   </w:num>
-  <w:num w:numId="23">
+  <w:num w:numId="23" w16cid:durableId="954756493">
     <w:abstractNumId w:val="14"/>
   </w:num>
-  <w:num w:numId="24">
+  <w:num w:numId="24" w16cid:durableId="1371684621">
     <w:abstractNumId w:val="5"/>
   </w:num>
-  <w:num w:numId="25">
+  <w:num w:numId="25" w16cid:durableId="422802954">
     <w:abstractNumId w:val="16"/>
   </w:num>
-  <w:num w:numId="26">
+  <w:num w:numId="26" w16cid:durableId="662973363">
     <w:abstractNumId w:val="20"/>
   </w:num>
-  <w:num w:numId="27">
+  <w:num w:numId="27" w16cid:durableId="955410063">
     <w:abstractNumId w:val="23"/>
   </w:num>
-  <w:num w:numId="28">
+  <w:num w:numId="28" w16cid:durableId="44527687">
     <w:abstractNumId w:val="0"/>
   </w:num>
-  <w:num w:numId="29">
+  <w:num w:numId="29" w16cid:durableId="623927199">
     <w:abstractNumId w:val="18"/>
   </w:num>
-  <w:num w:numId="30">
+  <w:num w:numId="30" w16cid:durableId="1020165589">
     <w:abstractNumId w:val="22"/>
   </w:num>
-  <w:num w:numId="31">
+  <w:num w:numId="31" w16cid:durableId="699404771">
     <w:abstractNumId w:val="2"/>
   </w:num>
-  <w:num w:numId="32">
+  <w:num w:numId="32" w16cid:durableId="698163383">
     <w:abstractNumId w:val="7"/>
   </w:num>
-  <w:num w:numId="33">
+  <w:num w:numId="33" w16cid:durableId="806706353">
     <w:abstractNumId w:val="32"/>
   </w:num>
-  <w:num w:numId="34">
+  <w:num w:numId="34" w16cid:durableId="1813594246">
     <w:abstractNumId w:val="38"/>
   </w:num>
-  <w:num w:numId="35">
+  <w:num w:numId="35" w16cid:durableId="342166651">
     <w:abstractNumId w:val="6"/>
   </w:num>
-  <w:num w:numId="36">
+  <w:num w:numId="36" w16cid:durableId="396980356">
     <w:abstractNumId w:val="25"/>
   </w:num>
-  <w:num w:numId="37">
+  <w:num w:numId="37" w16cid:durableId="1702315492">
     <w:abstractNumId w:val="37"/>
   </w:num>
-  <w:num w:numId="38">
+  <w:num w:numId="38" w16cid:durableId="948779030">
     <w:abstractNumId w:val="27"/>
   </w:num>
-  <w:num w:numId="39">
+  <w:num w:numId="39" w16cid:durableId="1790050493">
     <w:abstractNumId w:val="26"/>
   </w:num>
-  <w:num w:numId="40">
+  <w:num w:numId="40" w16cid:durableId="1870027758">
     <w:abstractNumId w:val="33"/>
   </w:num>
   <w:numIdMacAtCleanup w:val="18"/>
@@ -6616,7 +6924,7 @@
 </file>
 
 <file path=word/styles.xml><?xml version="1.0" encoding="utf-8"?>
-<w:styles xmlns:mc="http://schemas.openxmlformats.org/markup-compatibility/2006" xmlns:r="http://schemas.openxmlformats.org/officeDocument/2006/relationships" xmlns:w="http://schemas.openxmlformats.org/wordprocessingml/2006/main" xmlns:w14="http://schemas.microsoft.com/office/word/2010/wordml" xmlns:w15="http://schemas.microsoft.com/office/word/2012/wordml" xmlns:w16se="http://schemas.microsoft.com/office/word/2015/wordml/symex" mc:Ignorable="w14 w15 w16se">
+<w:styles xmlns:mc="http://schemas.openxmlformats.org/markup-compatibility/2006" xmlns:r="http://schemas.openxmlformats.org/officeDocument/2006/relationships" xmlns:w="http://schemas.openxmlformats.org/wordprocessingml/2006/main" xmlns:w14="http://schemas.microsoft.com/office/word/2010/wordml" xmlns:w15="http://schemas.microsoft.com/office/word/2012/wordml" xmlns:w16cex="http://schemas.microsoft.com/office/word/2018/wordml/cex" xmlns:w16cid="http://schemas.microsoft.com/office/word/2016/wordml/cid" xmlns:w16="http://schemas.microsoft.com/office/word/2018/wordml" xmlns:w16du="http://schemas.microsoft.com/office/word/2023/wordml/word16du" xmlns:w16sdtdh="http://schemas.microsoft.com/office/word/2020/wordml/sdtdatahash" xmlns:w16sdtfl="http://schemas.microsoft.com/office/word/2024/wordml/sdtformatlock" xmlns:w16se="http://schemas.microsoft.com/office/word/2015/wordml/symex" mc:Ignorable="w14 w15 w16se w16cid w16 w16cex w16sdtdh w16sdtfl w16du">
   <w:docDefaults>
     <w:rPrDefault>
       <w:rPr>
@@ -6632,7 +6940,7 @@
       </w:pPr>
     </w:pPrDefault>
   </w:docDefaults>
-  <w:latentStyles w:defLockedState="0" w:defUIPriority="99" w:defSemiHidden="0" w:defUnhideWhenUsed="0" w:defQFormat="0" w:count="371">
+  <w:latentStyles w:defLockedState="0" w:defUIPriority="99" w:defSemiHidden="0" w:defUnhideWhenUsed="0" w:defQFormat="0" w:count="376">
     <w:lsdException w:name="Normal" w:uiPriority="0" w:qFormat="1"/>
     <w:lsdException w:name="heading 1" w:uiPriority="9" w:qFormat="1"/>
     <w:lsdException w:name="heading 2" w:semiHidden="1" w:uiPriority="9" w:unhideWhenUsed="1" w:qFormat="1"/>
@@ -7004,6 +7312,11 @@
     <w:lsdException w:name="List Table 5 Dark Accent 6" w:uiPriority="50"/>
     <w:lsdException w:name="List Table 6 Colorful Accent 6" w:uiPriority="51"/>
     <w:lsdException w:name="List Table 7 Colorful Accent 6" w:uiPriority="52"/>
+    <w:lsdException w:name="Mention" w:semiHidden="1" w:unhideWhenUsed="1"/>
+    <w:lsdException w:name="Smart Hyperlink" w:semiHidden="1" w:unhideWhenUsed="1"/>
+    <w:lsdException w:name="Hashtag" w:semiHidden="1" w:unhideWhenUsed="1"/>
+    <w:lsdException w:name="Unresolved Mention" w:semiHidden="1" w:unhideWhenUsed="1"/>
+    <w:lsdException w:name="Smart Link" w:semiHidden="1" w:unhideWhenUsed="1"/>
   </w:latentStyles>
   <w:style w:type="paragraph" w:default="1" w:styleId="Normal">
     <w:name w:val="Normal"/>
@@ -7077,7 +7390,6 @@
   <w:style w:type="character" w:default="1" w:styleId="Fuentedeprrafopredeter">
     <w:name w:val="Default Paragraph Font"/>
     <w:uiPriority w:val="1"/>
-    <w:semiHidden/>
     <w:unhideWhenUsed/>
   </w:style>
   <w:style w:type="table" w:default="1" w:styleId="Tablanormal">
@@ -7987,7 +8299,7 @@
       <w:szCs w:val="24"/>
     </w:rPr>
   </w:style>
-  <w:style w:type="table" w:styleId="Cuadrculadetablaclara">
+  <w:style w:type="table" w:styleId="Tablaconcuadrculaclara">
     <w:name w:val="Grid Table Light"/>
     <w:basedOn w:val="Tablanormal"/>
     <w:uiPriority w:val="40"/>
@@ -8009,7 +8321,7 @@
   <w:style w:type="table" w:customStyle="1" w:styleId="Cuadrculadetablaclara1">
     <w:name w:val="Cuadrícula de tabla clara1"/>
     <w:basedOn w:val="Tablanormal"/>
-    <w:next w:val="Cuadrculadetablaclara"/>
+    <w:next w:val="Tablaconcuadrculaclara"/>
     <w:uiPriority w:val="40"/>
     <w:rsid w:val="00943DF1"/>
     <w:pPr>
@@ -8062,532 +8374,6 @@
     </w:rPr>
   </w:style>
 </w:styles>
-</file>
-
-<file path=word/glossary/document.xml><?xml version="1.0" encoding="utf-8"?>
-<w:glossaryDocument xmlns:wpc="http://schemas.microsoft.com/office/word/2010/wordprocessingCanvas" xmlns:cx="http://schemas.microsoft.com/office/drawing/2014/chartex" xmlns:mc="http://schemas.openxmlformats.org/markup-compatibility/2006" xmlns:o="urn:schemas-microsoft-com:office:office" xmlns:r="http://schemas.openxmlformats.org/officeDocument/2006/relationships" xmlns:m="http://schemas.openxmlformats.org/officeDocument/2006/math" xmlns:v="urn:schemas-microsoft-com:vml" xmlns:wp14="http://schemas.microsoft.com/office/word/2010/wordprocessingDrawing" xmlns:wp="http://schemas.openxmlformats.org/drawingml/2006/wordprocessingDrawing" xmlns:w10="urn:schemas-microsoft-com:office:word" xmlns:w="http://schemas.openxmlformats.org/wordprocessingml/2006/main" xmlns:w14="http://schemas.microsoft.com/office/word/2010/wordml" xmlns:w15="http://schemas.microsoft.com/office/word/2012/wordml" xmlns:w16se="http://schemas.microsoft.com/office/word/2015/wordml/symex" xmlns:wpg="http://schemas.microsoft.com/office/word/2010/wordprocessingGroup" xmlns:wpi="http://schemas.microsoft.com/office/word/2010/wordprocessingInk" xmlns:wne="http://schemas.microsoft.com/office/word/2006/wordml" xmlns:wps="http://schemas.microsoft.com/office/word/2010/wordprocessingShape" mc:Ignorable="w14 w15 w16se wp14"/>
-</file>
-
-<file path=word/glossary/fontTable.xml><?xml version="1.0" encoding="utf-8"?>
-<w:fonts xmlns:mc="http://schemas.openxmlformats.org/markup-compatibility/2006" xmlns:r="http://schemas.openxmlformats.org/officeDocument/2006/relationships" xmlns:w="http://schemas.openxmlformats.org/wordprocessingml/2006/main" xmlns:w14="http://schemas.microsoft.com/office/word/2010/wordml" xmlns:w15="http://schemas.microsoft.com/office/word/2012/wordml" xmlns:w16se="http://schemas.microsoft.com/office/word/2015/wordml/symex" mc:Ignorable="w14 w15 w16se">
-  <w:font w:name="Calibri">
-    <w:panose1 w:val="020F0502020204030204"/>
-    <w:charset w:val="00"/>
-    <w:family w:val="swiss"/>
-    <w:pitch w:val="variable"/>
-    <w:sig w:usb0="E4002EFF" w:usb1="C000247B" w:usb2="00000009" w:usb3="00000000" w:csb0="000001FF" w:csb1="00000000"/>
-  </w:font>
-  <w:font w:name="Times New Roman">
-    <w:panose1 w:val="02020603050405020304"/>
-    <w:charset w:val="00"/>
-    <w:family w:val="roman"/>
-    <w:pitch w:val="variable"/>
-    <w:sig w:usb0="E0002EFF" w:usb1="C000785B" w:usb2="00000009" w:usb3="00000000" w:csb0="000001FF" w:csb1="00000000"/>
-  </w:font>
-  <w:font w:name="Courier New">
-    <w:panose1 w:val="02070309020205020404"/>
-    <w:charset w:val="00"/>
-    <w:family w:val="modern"/>
-    <w:pitch w:val="fixed"/>
-    <w:sig w:usb0="E0002EFF" w:usb1="C0007843" w:usb2="00000009" w:usb3="00000000" w:csb0="000001FF" w:csb1="00000000"/>
-  </w:font>
-  <w:font w:name="Wingdings">
-    <w:panose1 w:val="05000000000000000000"/>
-    <w:charset w:val="02"/>
-    <w:family w:val="auto"/>
-    <w:pitch w:val="variable"/>
-    <w:sig w:usb0="00000000" w:usb1="10000000" w:usb2="00000000" w:usb3="00000000" w:csb0="80000000" w:csb1="00000000"/>
-  </w:font>
-  <w:font w:name="Symbol">
-    <w:panose1 w:val="05050102010706020507"/>
-    <w:charset w:val="02"/>
-    <w:family w:val="roman"/>
-    <w:pitch w:val="variable"/>
-    <w:sig w:usb0="00000000" w:usb1="10000000" w:usb2="00000000" w:usb3="00000000" w:csb0="80000000" w:csb1="00000000"/>
-  </w:font>
-  <w:font w:name="Calibri Light">
-    <w:panose1 w:val="020F0302020204030204"/>
-    <w:charset w:val="00"/>
-    <w:family w:val="swiss"/>
-    <w:pitch w:val="variable"/>
-    <w:sig w:usb0="E4002EFF" w:usb1="C000247B" w:usb2="00000009" w:usb3="00000000" w:csb0="000001FF" w:csb1="00000000"/>
-  </w:font>
-  <w:font w:name="Segoe UI">
-    <w:panose1 w:val="020B0502040204020203"/>
-    <w:charset w:val="00"/>
-    <w:family w:val="swiss"/>
-    <w:pitch w:val="variable"/>
-    <w:sig w:usb0="E4002EFF" w:usb1="C000E47F" w:usb2="00000009" w:usb3="00000000" w:csb0="000001FF" w:csb1="00000000"/>
-  </w:font>
-  <w:font w:name="Century Gothic">
-    <w:panose1 w:val="020B0502020202020204"/>
-    <w:charset w:val="00"/>
-    <w:family w:val="swiss"/>
-    <w:pitch w:val="variable"/>
-    <w:sig w:usb0="00000287" w:usb1="00000000" w:usb2="00000000" w:usb3="00000000" w:csb0="0000009F" w:csb1="00000000"/>
-  </w:font>
-</w:fonts>
-</file>
-
-<file path=word/glossary/settings.xml><?xml version="1.0" encoding="utf-8"?>
-<w:settings xmlns:mc="http://schemas.openxmlformats.org/markup-compatibility/2006" xmlns:o="urn:schemas-microsoft-com:office:office" xmlns:r="http://schemas.openxmlformats.org/officeDocument/2006/relationships" xmlns:m="http://schemas.openxmlformats.org/officeDocument/2006/math" xmlns:v="urn:schemas-microsoft-com:vml" xmlns:w10="urn:schemas-microsoft-com:office:word" xmlns:w="http://schemas.openxmlformats.org/wordprocessingml/2006/main" xmlns:w14="http://schemas.microsoft.com/office/word/2010/wordml" xmlns:w15="http://schemas.microsoft.com/office/word/2012/wordml" xmlns:w16se="http://schemas.microsoft.com/office/word/2015/wordml/symex" xmlns:sl="http://schemas.openxmlformats.org/schemaLibrary/2006/main" mc:Ignorable="w14 w15 w16se">
-  <w:defaultTabStop w:val="708"/>
-  <w:hyphenationZone w:val="425"/>
-  <w:characterSpacingControl w:val="doNotCompress"/>
-  <w:compat>
-    <w:useFELayout/>
-    <w:compatSetting w:name="compatibilityMode" w:uri="http://schemas.microsoft.com/office/word" w:val="12"/>
-  </w:compat>
-  <w:rsids>
-    <w:rsidRoot w:val="009A1234"/>
-    <w:rsid w:val="009A1234"/>
-  </w:rsids>
-  <m:mathPr>
-    <m:mathFont m:val="Cambria Math"/>
-    <m:brkBin m:val="before"/>
-    <m:brkBinSub m:val="--"/>
-    <m:smallFrac m:val="0"/>
-    <m:dispDef/>
-    <m:lMargin m:val="0"/>
-    <m:rMargin m:val="0"/>
-    <m:defJc m:val="centerGroup"/>
-    <m:wrapIndent m:val="1440"/>
-    <m:intLim m:val="subSup"/>
-    <m:naryLim m:val="undOvr"/>
-  </m:mathPr>
-  <w:themeFontLang w:val="es-CL"/>
-  <w:clrSchemeMapping w:bg1="light1" w:t1="dark1" w:bg2="light2" w:t2="dark2" w:accent1="accent1" w:accent2="accent2" w:accent3="accent3" w:accent4="accent4" w:accent5="accent5" w:accent6="accent6" w:hyperlink="hyperlink" w:followedHyperlink="followedHyperlink"/>
-  <w:decimalSymbol w:val=","/>
-  <w:listSeparator w:val=";"/>
-</w:settings>
-</file>
-
-<file path=word/glossary/styles.xml><?xml version="1.0" encoding="utf-8"?>
-<w:styles xmlns:mc="http://schemas.openxmlformats.org/markup-compatibility/2006" xmlns:r="http://schemas.openxmlformats.org/officeDocument/2006/relationships" xmlns:w="http://schemas.openxmlformats.org/wordprocessingml/2006/main" xmlns:w14="http://schemas.microsoft.com/office/word/2010/wordml" xmlns:w15="http://schemas.microsoft.com/office/word/2012/wordml" xmlns:w16se="http://schemas.microsoft.com/office/word/2015/wordml/symex" mc:Ignorable="w14 w15 w16se">
-  <w:docDefaults>
-    <w:rPrDefault>
-      <w:rPr>
-        <w:rFonts w:asciiTheme="minorHAnsi" w:eastAsiaTheme="minorEastAsia" w:hAnsiTheme="minorHAnsi" w:cstheme="minorBidi"/>
-        <w:sz w:val="22"/>
-        <w:szCs w:val="22"/>
-        <w:lang w:val="es-CL" w:eastAsia="es-CL" w:bidi="ar-SA"/>
-      </w:rPr>
-    </w:rPrDefault>
-    <w:pPrDefault>
-      <w:pPr>
-        <w:spacing w:after="160" w:line="259" w:lineRule="auto"/>
-      </w:pPr>
-    </w:pPrDefault>
-  </w:docDefaults>
-  <w:latentStyles w:defLockedState="0" w:defUIPriority="99" w:defSemiHidden="0" w:defUnhideWhenUsed="0" w:defQFormat="0" w:count="371">
-    <w:lsdException w:name="Normal" w:uiPriority="0" w:qFormat="1"/>
-    <w:lsdException w:name="heading 1" w:uiPriority="9" w:qFormat="1"/>
-    <w:lsdException w:name="heading 2" w:semiHidden="1" w:uiPriority="9" w:unhideWhenUsed="1" w:qFormat="1"/>
-    <w:lsdException w:name="heading 3" w:semiHidden="1" w:uiPriority="9" w:unhideWhenUsed="1" w:qFormat="1"/>
-    <w:lsdException w:name="heading 4" w:semiHidden="1" w:uiPriority="9" w:unhideWhenUsed="1" w:qFormat="1"/>
-    <w:lsdException w:name="heading 5" w:semiHidden="1" w:uiPriority="9" w:unhideWhenUsed="1" w:qFormat="1"/>
-    <w:lsdException w:name="heading 6" w:semiHidden="1" w:uiPriority="9" w:unhideWhenUsed="1" w:qFormat="1"/>
-    <w:lsdException w:name="heading 7" w:semiHidden="1" w:uiPriority="9" w:unhideWhenUsed="1" w:qFormat="1"/>
-    <w:lsdException w:name="heading 8" w:semiHidden="1" w:uiPriority="9" w:unhideWhenUsed="1" w:qFormat="1"/>
-    <w:lsdException w:name="heading 9" w:semiHidden="1" w:uiPriority="9" w:unhideWhenUsed="1" w:qFormat="1"/>
-    <w:lsdException w:name="index 1" w:semiHidden="1" w:unhideWhenUsed="1"/>
-    <w:lsdException w:name="index 2" w:semiHidden="1" w:unhideWhenUsed="1"/>
-    <w:lsdException w:name="index 3" w:semiHidden="1" w:unhideWhenUsed="1"/>
-    <w:lsdException w:name="index 4" w:semiHidden="1" w:unhideWhenUsed="1"/>
-    <w:lsdException w:name="index 5" w:semiHidden="1" w:unhideWhenUsed="1"/>
-    <w:lsdException w:name="index 6" w:semiHidden="1" w:unhideWhenUsed="1"/>
-    <w:lsdException w:name="index 7" w:semiHidden="1" w:unhideWhenUsed="1"/>
-    <w:lsdException w:name="index 8" w:semiHidden="1" w:unhideWhenUsed="1"/>
-    <w:lsdException w:name="index 9" w:semiHidden="1" w:unhideWhenUsed="1"/>
-    <w:lsdException w:name="toc 1" w:semiHidden="1" w:uiPriority="39" w:unhideWhenUsed="1"/>
-    <w:lsdException w:name="toc 2" w:semiHidden="1" w:uiPriority="39" w:unhideWhenUsed="1"/>
-    <w:lsdException w:name="toc 3" w:semiHidden="1" w:uiPriority="39" w:unhideWhenUsed="1"/>
-    <w:lsdException w:name="toc 4" w:semiHidden="1" w:uiPriority="39" w:unhideWhenUsed="1"/>
-    <w:lsdException w:name="toc 5" w:semiHidden="1" w:uiPriority="39" w:unhideWhenUsed="1"/>
-    <w:lsdException w:name="toc 6" w:semiHidden="1" w:uiPriority="39" w:unhideWhenUsed="1"/>
-    <w:lsdException w:name="toc 7" w:semiHidden="1" w:uiPriority="39" w:unhideWhenUsed="1"/>
-    <w:lsdException w:name="toc 8" w:semiHidden="1" w:uiPriority="39" w:unhideWhenUsed="1"/>
-    <w:lsdException w:name="toc 9" w:semiHidden="1" w:uiPriority="39" w:unhideWhenUsed="1"/>
-    <w:lsdException w:name="Normal Indent" w:semiHidden="1" w:unhideWhenUsed="1"/>
-    <w:lsdException w:name="footnote text" w:semiHidden="1" w:unhideWhenUsed="1"/>
-    <w:lsdException w:name="annotation text" w:semiHidden="1" w:unhideWhenUsed="1"/>
-    <w:lsdException w:name="header" w:semiHidden="1" w:unhideWhenUsed="1"/>
-    <w:lsdException w:name="footer" w:semiHidden="1" w:unhideWhenUsed="1"/>
-    <w:lsdException w:name="index heading" w:semiHidden="1" w:unhideWhenUsed="1"/>
-    <w:lsdException w:name="caption" w:semiHidden="1" w:uiPriority="35" w:unhideWhenUsed="1" w:qFormat="1"/>
-    <w:lsdException w:name="table of figures" w:semiHidden="1" w:unhideWhenUsed="1"/>
-    <w:lsdException w:name="envelope address" w:semiHidden="1" w:unhideWhenUsed="1"/>
-    <w:lsdException w:name="envelope return" w:semiHidden="1" w:unhideWhenUsed="1"/>
-    <w:lsdException w:name="footnote reference" w:semiHidden="1" w:unhideWhenUsed="1"/>
-    <w:lsdException w:name="annotation reference" w:semiHidden="1" w:unhideWhenUsed="1"/>
-    <w:lsdException w:name="line number" w:semiHidden="1" w:unhideWhenUsed="1"/>
-    <w:lsdException w:name="page number" w:semiHidden="1" w:unhideWhenUsed="1"/>
-    <w:lsdException w:name="endnote reference" w:semiHidden="1" w:unhideWhenUsed="1"/>
-    <w:lsdException w:name="endnote text" w:semiHidden="1" w:unhideWhenUsed="1"/>
-    <w:lsdException w:name="table of authorities" w:semiHidden="1" w:unhideWhenUsed="1"/>
-    <w:lsdException w:name="macro" w:semiHidden="1" w:unhideWhenUsed="1"/>
-    <w:lsdException w:name="toa heading" w:semiHidden="1" w:unhideWhenUsed="1"/>
-    <w:lsdException w:name="List" w:semiHidden="1" w:unhideWhenUsed="1"/>
-    <w:lsdException w:name="List Bullet" w:semiHidden="1" w:unhideWhenUsed="1"/>
-    <w:lsdException w:name="List Number" w:semiHidden="1" w:unhideWhenUsed="1"/>
-    <w:lsdException w:name="List 2" w:semiHidden="1" w:unhideWhenUsed="1"/>
-    <w:lsdException w:name="List 3" w:semiHidden="1" w:unhideWhenUsed="1"/>
-    <w:lsdException w:name="List 4" w:semiHidden="1" w:unhideWhenUsed="1"/>
-    <w:lsdException w:name="List 5" w:semiHidden="1" w:unhideWhenUsed="1"/>
-    <w:lsdException w:name="List Bullet 2" w:semiHidden="1" w:unhideWhenUsed="1"/>
-    <w:lsdException w:name="List Bullet 3" w:semiHidden="1" w:unhideWhenUsed="1"/>
-    <w:lsdException w:name="List Bullet 4" w:semiHidden="1" w:unhideWhenUsed="1"/>
-    <w:lsdException w:name="List Bullet 5" w:semiHidden="1" w:unhideWhenUsed="1"/>
-    <w:lsdException w:name="List Number 2" w:semiHidden="1" w:unhideWhenUsed="1"/>
-    <w:lsdException w:name="List Number 3" w:semiHidden="1" w:unhideWhenUsed="1"/>
-    <w:lsdException w:name="List Number 4" w:semiHidden="1" w:unhideWhenUsed="1"/>
-    <w:lsdException w:name="List Number 5" w:semiHidden="1" w:unhideWhenUsed="1"/>
-    <w:lsdException w:name="Title" w:uiPriority="10" w:qFormat="1"/>
-    <w:lsdException w:name="Closing" w:semiHidden="1" w:unhideWhenUsed="1"/>
-    <w:lsdException w:name="Signature" w:semiHidden="1" w:unhideWhenUsed="1"/>
-    <w:lsdException w:name="Default Paragraph Font" w:semiHidden="1" w:uiPriority="1" w:unhideWhenUsed="1"/>
-    <w:lsdException w:name="Body Text" w:semiHidden="1" w:unhideWhenUsed="1"/>
-    <w:lsdException w:name="Body Text Indent" w:semiHidden="1" w:unhideWhenUsed="1"/>
-    <w:lsdException w:name="List Continue" w:semiHidden="1" w:unhideWhenUsed="1"/>
-    <w:lsdException w:name="List Continue 2" w:semiHidden="1" w:unhideWhenUsed="1"/>
-    <w:lsdException w:name="List Continue 3" w:semiHidden="1" w:unhideWhenUsed="1"/>
-    <w:lsdException w:name="List Continue 4" w:semiHidden="1" w:unhideWhenUsed="1"/>
-    <w:lsdException w:name="List Continue 5" w:semiHidden="1" w:unhideWhenUsed="1"/>
-    <w:lsdException w:name="Message Header" w:semiHidden="1" w:unhideWhenUsed="1"/>
-    <w:lsdException w:name="Subtitle" w:uiPriority="11" w:qFormat="1"/>
-    <w:lsdException w:name="Salutation" w:semiHidden="1" w:unhideWhenUsed="1"/>
-    <w:lsdException w:name="Date" w:semiHidden="1" w:unhideWhenUsed="1"/>
-    <w:lsdException w:name="Body Text First Indent" w:semiHidden="1" w:unhideWhenUsed="1"/>
-    <w:lsdException w:name="Body Text First Indent 2" w:semiHidden="1" w:unhideWhenUsed="1"/>
-    <w:lsdException w:name="Note Heading" w:semiHidden="1" w:unhideWhenUsed="1"/>
-    <w:lsdException w:name="Body Text 2" w:semiHidden="1" w:unhideWhenUsed="1"/>
-    <w:lsdException w:name="Body Text 3" w:semiHidden="1" w:unhideWhenUsed="1"/>
-    <w:lsdException w:name="Body Text Indent 2" w:semiHidden="1" w:unhideWhenUsed="1"/>
-    <w:lsdException w:name="Body Text Indent 3" w:semiHidden="1" w:unhideWhenUsed="1"/>
-    <w:lsdException w:name="Block Text" w:semiHidden="1" w:unhideWhenUsed="1"/>
-    <w:lsdException w:name="Hyperlink" w:semiHidden="1" w:unhideWhenUsed="1"/>
-    <w:lsdException w:name="FollowedHyperlink" w:semiHidden="1" w:unhideWhenUsed="1"/>
-    <w:lsdException w:name="Strong" w:uiPriority="22" w:qFormat="1"/>
-    <w:lsdException w:name="Emphasis" w:uiPriority="20" w:qFormat="1"/>
-    <w:lsdException w:name="Document Map" w:semiHidden="1" w:unhideWhenUsed="1"/>
-    <w:lsdException w:name="Plain Text" w:semiHidden="1" w:unhideWhenUsed="1"/>
-    <w:lsdException w:name="E-mail Signature" w:semiHidden="1" w:unhideWhenUsed="1"/>
-    <w:lsdException w:name="HTML Top of Form" w:semiHidden="1" w:unhideWhenUsed="1"/>
-    <w:lsdException w:name="HTML Bottom of Form" w:semiHidden="1" w:unhideWhenUsed="1"/>
-    <w:lsdException w:name="Normal (Web)" w:semiHidden="1" w:unhideWhenUsed="1"/>
-    <w:lsdException w:name="HTML Acronym" w:semiHidden="1" w:unhideWhenUsed="1"/>
-    <w:lsdException w:name="HTML Address" w:semiHidden="1" w:unhideWhenUsed="1"/>
-    <w:lsdException w:name="HTML Cite" w:semiHidden="1" w:unhideWhenUsed="1"/>
-    <w:lsdException w:name="HTML Code" w:semiHidden="1" w:unhideWhenUsed="1"/>
-    <w:lsdException w:name="HTML Definition" w:semiHidden="1" w:unhideWhenUsed="1"/>
-    <w:lsdException w:name="HTML Keyboard" w:semiHidden="1" w:unhideWhenUsed="1"/>
-    <w:lsdException w:name="HTML Preformatted" w:semiHidden="1" w:unhideWhenUsed="1"/>
-    <w:lsdException w:name="HTML Sample" w:semiHidden="1" w:unhideWhenUsed="1"/>
-    <w:lsdException w:name="HTML Typewriter" w:semiHidden="1" w:unhideWhenUsed="1"/>
-    <w:lsdException w:name="HTML Variable" w:semiHidden="1" w:unhideWhenUsed="1"/>
-    <w:lsdException w:name="Normal Table" w:semiHidden="1" w:unhideWhenUsed="1"/>
-    <w:lsdException w:name="annotation subject" w:semiHidden="1" w:unhideWhenUsed="1"/>
-    <w:lsdException w:name="No List" w:semiHidden="1" w:unhideWhenUsed="1"/>
-    <w:lsdException w:name="Outline List 1" w:semiHidden="1" w:unhideWhenUsed="1"/>
-    <w:lsdException w:name="Outline List 2" w:semiHidden="1" w:unhideWhenUsed="1"/>
-    <w:lsdException w:name="Outline List 3" w:semiHidden="1" w:unhideWhenUsed="1"/>
-    <w:lsdException w:name="Table Simple 1" w:semiHidden="1" w:unhideWhenUsed="1"/>
-    <w:lsdException w:name="Table Simple 2" w:semiHidden="1" w:unhideWhenUsed="1"/>
-    <w:lsdException w:name="Table Simple 3" w:semiHidden="1" w:unhideWhenUsed="1"/>
-    <w:lsdException w:name="Table Classic 1" w:semiHidden="1" w:unhideWhenUsed="1"/>
-    <w:lsdException w:name="Table Classic 2" w:semiHidden="1" w:unhideWhenUsed="1"/>
-    <w:lsdException w:name="Table Classic 3" w:semiHidden="1" w:unhideWhenUsed="1"/>
-    <w:lsdException w:name="Table Classic 4" w:semiHidden="1" w:unhideWhenUsed="1"/>
-    <w:lsdException w:name="Table Colorful 1" w:semiHidden="1" w:unhideWhenUsed="1"/>
-    <w:lsdException w:name="Table Colorful 2" w:semiHidden="1" w:unhideWhenUsed="1"/>
-    <w:lsdException w:name="Table Colorful 3" w:semiHidden="1" w:unhideWhenUsed="1"/>
-    <w:lsdException w:name="Table Columns 1" w:semiHidden="1" w:unhideWhenUsed="1"/>
-    <w:lsdException w:name="Table Columns 2" w:semiHidden="1" w:unhideWhenUsed="1"/>
-    <w:lsdException w:name="Table Columns 3" w:semiHidden="1" w:unhideWhenUsed="1"/>
-    <w:lsdException w:name="Table Columns 4" w:semiHidden="1" w:unhideWhenUsed="1"/>
-    <w:lsdException w:name="Table Columns 5" w:semiHidden="1" w:unhideWhenUsed="1"/>
-    <w:lsdException w:name="Table Grid 1" w:semiHidden="1" w:unhideWhenUsed="1"/>
-    <w:lsdException w:name="Table Grid 2" w:semiHidden="1" w:unhideWhenUsed="1"/>
-    <w:lsdException w:name="Table Grid 3" w:semiHidden="1" w:unhideWhenUsed="1"/>
-    <w:lsdException w:name="Table Grid 4" w:semiHidden="1" w:unhideWhenUsed="1"/>
-    <w:lsdException w:name="Table Grid 5" w:semiHidden="1" w:unhideWhenUsed="1"/>
-    <w:lsdException w:name="Table Grid 6" w:semiHidden="1" w:unhideWhenUsed="1"/>
-    <w:lsdException w:name="Table Grid 7" w:semiHidden="1" w:unhideWhenUsed="1"/>
-    <w:lsdException w:name="Table Grid 8" w:semiHidden="1" w:unhideWhenUsed="1"/>
-    <w:lsdException w:name="Table List 1" w:semiHidden="1" w:unhideWhenUsed="1"/>
-    <w:lsdException w:name="Table List 2" w:semiHidden="1" w:unhideWhenUsed="1"/>
-    <w:lsdException w:name="Table List 3" w:semiHidden="1" w:unhideWhenUsed="1"/>
-    <w:lsdException w:name="Table List 4" w:semiHidden="1" w:unhideWhenUsed="1"/>
-    <w:lsdException w:name="Table List 5" w:semiHidden="1" w:unhideWhenUsed="1"/>
-    <w:lsdException w:name="Table List 6" w:semiHidden="1" w:unhideWhenUsed="1"/>
-    <w:lsdException w:name="Table List 7" w:semiHidden="1" w:unhideWhenUsed="1"/>
-    <w:lsdException w:name="Table List 8" w:semiHidden="1" w:unhideWhenUsed="1"/>
-    <w:lsdException w:name="Table 3D effects 1" w:semiHidden="1" w:unhideWhenUsed="1"/>
-    <w:lsdException w:name="Table 3D effects 2" w:semiHidden="1" w:unhideWhenUsed="1"/>
-    <w:lsdException w:name="Table 3D effects 3" w:semiHidden="1" w:unhideWhenUsed="1"/>
-    <w:lsdException w:name="Table Contemporary" w:semiHidden="1" w:unhideWhenUsed="1"/>
-    <w:lsdException w:name="Table Elegant" w:semiHidden="1" w:unhideWhenUsed="1"/>
-    <w:lsdException w:name="Table Professional" w:semiHidden="1" w:unhideWhenUsed="1"/>
-    <w:lsdException w:name="Table Subtle 1" w:semiHidden="1" w:unhideWhenUsed="1"/>
-    <w:lsdException w:name="Table Subtle 2" w:semiHidden="1" w:unhideWhenUsed="1"/>
-    <w:lsdException w:name="Table Web 1" w:semiHidden="1" w:unhideWhenUsed="1"/>
-    <w:lsdException w:name="Table Web 2" w:semiHidden="1" w:unhideWhenUsed="1"/>
-    <w:lsdException w:name="Table Web 3" w:semiHidden="1" w:unhideWhenUsed="1"/>
-    <w:lsdException w:name="Balloon Text" w:semiHidden="1" w:unhideWhenUsed="1"/>
-    <w:lsdException w:name="Table Grid" w:uiPriority="39"/>
-    <w:lsdException w:name="Table Theme" w:semiHidden="1" w:unhideWhenUsed="1"/>
-    <w:lsdException w:name="Placeholder Text" w:semiHidden="1"/>
-    <w:lsdException w:name="No Spacing" w:uiPriority="1" w:qFormat="1"/>
-    <w:lsdException w:name="Light Shading" w:uiPriority="60"/>
-    <w:lsdException w:name="Light List" w:uiPriority="61"/>
-    <w:lsdException w:name="Light Grid" w:uiPriority="62"/>
-    <w:lsdException w:name="Medium Shading 1" w:uiPriority="63"/>
-    <w:lsdException w:name="Medium Shading 2" w:uiPriority="64"/>
-    <w:lsdException w:name="Medium List 1" w:uiPriority="65"/>
-    <w:lsdException w:name="Medium List 2" w:uiPriority="66"/>
-    <w:lsdException w:name="Medium Grid 1" w:uiPriority="67"/>
-    <w:lsdException w:name="Medium Grid 2" w:uiPriority="68"/>
-    <w:lsdException w:name="Medium Grid 3" w:uiPriority="69"/>
-    <w:lsdException w:name="Dark List" w:uiPriority="70"/>
-    <w:lsdException w:name="Colorful Shading" w:uiPriority="71"/>
-    <w:lsdException w:name="Colorful List" w:uiPriority="72"/>
-    <w:lsdException w:name="Colorful Grid" w:uiPriority="73"/>
-    <w:lsdException w:name="Light Shading Accent 1" w:uiPriority="60"/>
-    <w:lsdException w:name="Light List Accent 1" w:uiPriority="61"/>
-    <w:lsdException w:name="Light Grid Accent 1" w:uiPriority="62"/>
-    <w:lsdException w:name="Medium Shading 1 Accent 1" w:uiPriority="63"/>
-    <w:lsdException w:name="Medium Shading 2 Accent 1" w:uiPriority="64"/>
-    <w:lsdException w:name="Medium List 1 Accent 1" w:uiPriority="65"/>
-    <w:lsdException w:name="Revision" w:semiHidden="1"/>
-    <w:lsdException w:name="List Paragraph" w:uiPriority="34" w:qFormat="1"/>
-    <w:lsdException w:name="Quote" w:uiPriority="29" w:qFormat="1"/>
-    <w:lsdException w:name="Intense Quote" w:uiPriority="30" w:qFormat="1"/>
-    <w:lsdException w:name="Medium List 2 Accent 1" w:uiPriority="66"/>
-    <w:lsdException w:name="Medium Grid 1 Accent 1" w:uiPriority="67"/>
-    <w:lsdException w:name="Medium Grid 2 Accent 1" w:uiPriority="68"/>
-    <w:lsdException w:name="Medium Grid 3 Accent 1" w:uiPriority="69"/>
-    <w:lsdException w:name="Dark List Accent 1" w:uiPriority="70"/>
-    <w:lsdException w:name="Colorful Shading Accent 1" w:uiPriority="71"/>
-    <w:lsdException w:name="Colorful List Accent 1" w:uiPriority="72"/>
-    <w:lsdException w:name="Colorful Grid Accent 1" w:uiPriority="73"/>
-    <w:lsdException w:name="Light Shading Accent 2" w:uiPriority="60"/>
-    <w:lsdException w:name="Light List Accent 2" w:uiPriority="61"/>
-    <w:lsdException w:name="Light Grid Accent 2" w:uiPriority="62"/>
-    <w:lsdException w:name="Medium Shading 1 Accent 2" w:uiPriority="63"/>
-    <w:lsdException w:name="Medium Shading 2 Accent 2" w:uiPriority="64"/>
-    <w:lsdException w:name="Medium List 1 Accent 2" w:uiPriority="65"/>
-    <w:lsdException w:name="Medium List 2 Accent 2" w:uiPriority="66"/>
-    <w:lsdException w:name="Medium Grid 1 Accent 2" w:uiPriority="67"/>
-    <w:lsdException w:name="Medium Grid 2 Accent 2" w:uiPriority="68"/>
-    <w:lsdException w:name="Medium Grid 3 Accent 2" w:uiPriority="69"/>
-    <w:lsdException w:name="Dark List Accent 2" w:uiPriority="70"/>
-    <w:lsdException w:name="Colorful Shading Accent 2" w:uiPriority="71"/>
-    <w:lsdException w:name="Colorful List Accent 2" w:uiPriority="72"/>
-    <w:lsdException w:name="Colorful Grid Accent 2" w:uiPriority="73"/>
-    <w:lsdException w:name="Light Shading Accent 3" w:uiPriority="60"/>
-    <w:lsdException w:name="Light List Accent 3" w:uiPriority="61"/>
-    <w:lsdException w:name="Light Grid Accent 3" w:uiPriority="62"/>
-    <w:lsdException w:name="Medium Shading 1 Accent 3" w:uiPriority="63"/>
-    <w:lsdException w:name="Medium Shading 2 Accent 3" w:uiPriority="64"/>
-    <w:lsdException w:name="Medium List 1 Accent 3" w:uiPriority="65"/>
-    <w:lsdException w:name="Medium List 2 Accent 3" w:uiPriority="66"/>
-    <w:lsdException w:name="Medium Grid 1 Accent 3" w:uiPriority="67"/>
-    <w:lsdException w:name="Medium Grid 2 Accent 3" w:uiPriority="68"/>
-    <w:lsdException w:name="Medium Grid 3 Accent 3" w:uiPriority="69"/>
-    <w:lsdException w:name="Dark List Accent 3" w:uiPriority="70"/>
-    <w:lsdException w:name="Colorful Shading Accent 3" w:uiPriority="71"/>
-    <w:lsdException w:name="Colorful List Accent 3" w:uiPriority="72"/>
-    <w:lsdException w:name="Colorful Grid Accent 3" w:uiPriority="73"/>
-    <w:lsdException w:name="Light Shading Accent 4" w:uiPriority="60"/>
-    <w:lsdException w:name="Light List Accent 4" w:uiPriority="61"/>
-    <w:lsdException w:name="Light Grid Accent 4" w:uiPriority="62"/>
-    <w:lsdException w:name="Medium Shading 1 Accent 4" w:uiPriority="63"/>
-    <w:lsdException w:name="Medium Shading 2 Accent 4" w:uiPriority="64"/>
-    <w:lsdException w:name="Medium List 1 Accent 4" w:uiPriority="65"/>
-    <w:lsdException w:name="Medium List 2 Accent 4" w:uiPriority="66"/>
-    <w:lsdException w:name="Medium Grid 1 Accent 4" w:uiPriority="67"/>
-    <w:lsdException w:name="Medium Grid 2 Accent 4" w:uiPriority="68"/>
-    <w:lsdException w:name="Medium Grid 3 Accent 4" w:uiPriority="69"/>
-    <w:lsdException w:name="Dark List Accent 4" w:uiPriority="70"/>
-    <w:lsdException w:name="Colorful Shading Accent 4" w:uiPriority="71"/>
-    <w:lsdException w:name="Colorful List Accent 4" w:uiPriority="72"/>
-    <w:lsdException w:name="Colorful Grid Accent 4" w:uiPriority="73"/>
-    <w:lsdException w:name="Light Shading Accent 5" w:uiPriority="60"/>
-    <w:lsdException w:name="Light List Accent 5" w:uiPriority="61"/>
-    <w:lsdException w:name="Light Grid Accent 5" w:uiPriority="62"/>
-    <w:lsdException w:name="Medium Shading 1 Accent 5" w:uiPriority="63"/>
-    <w:lsdException w:name="Medium Shading 2 Accent 5" w:uiPriority="64"/>
-    <w:lsdException w:name="Medium List 1 Accent 5" w:uiPriority="65"/>
-    <w:lsdException w:name="Medium List 2 Accent 5" w:uiPriority="66"/>
-    <w:lsdException w:name="Medium Grid 1 Accent 5" w:uiPriority="67"/>
-    <w:lsdException w:name="Medium Grid 2 Accent 5" w:uiPriority="68"/>
-    <w:lsdException w:name="Medium Grid 3 Accent 5" w:uiPriority="69"/>
-    <w:lsdException w:name="Dark List Accent 5" w:uiPriority="70"/>
-    <w:lsdException w:name="Colorful Shading Accent 5" w:uiPriority="71"/>
-    <w:lsdException w:name="Colorful List Accent 5" w:uiPriority="72"/>
-    <w:lsdException w:name="Colorful Grid Accent 5" w:uiPriority="73"/>
-    <w:lsdException w:name="Light Shading Accent 6" w:uiPriority="60"/>
-    <w:lsdException w:name="Light List Accent 6" w:uiPriority="61"/>
-    <w:lsdException w:name="Light Grid Accent 6" w:uiPriority="62"/>
-    <w:lsdException w:name="Medium Shading 1 Accent 6" w:uiPriority="63"/>
-    <w:lsdException w:name="Medium Shading 2 Accent 6" w:uiPriority="64"/>
-    <w:lsdException w:name="Medium List 1 Accent 6" w:uiPriority="65"/>
-    <w:lsdException w:name="Medium List 2 Accent 6" w:uiPriority="66"/>
-    <w:lsdException w:name="Medium Grid 1 Accent 6" w:uiPriority="67"/>
-    <w:lsdException w:name="Medium Grid 2 Accent 6" w:uiPriority="68"/>
-    <w:lsdException w:name="Medium Grid 3 Accent 6" w:uiPriority="69"/>
-    <w:lsdException w:name="Dark List Accent 6" w:uiPriority="70"/>
-    <w:lsdException w:name="Colorful Shading Accent 6" w:uiPriority="71"/>
-    <w:lsdException w:name="Colorful List Accent 6" w:uiPriority="72"/>
-    <w:lsdException w:name="Colorful Grid Accent 6" w:uiPriority="73"/>
-    <w:lsdException w:name="Subtle Emphasis" w:uiPriority="19" w:qFormat="1"/>
-    <w:lsdException w:name="Intense Emphasis" w:uiPriority="21" w:qFormat="1"/>
-    <w:lsdException w:name="Subtle Reference" w:uiPriority="31" w:qFormat="1"/>
-    <w:lsdException w:name="Intense Reference" w:uiPriority="32" w:qFormat="1"/>
-    <w:lsdException w:name="Book Title" w:uiPriority="33" w:qFormat="1"/>
-    <w:lsdException w:name="Bibliography" w:semiHidden="1" w:uiPriority="37" w:unhideWhenUsed="1"/>
-    <w:lsdException w:name="TOC Heading" w:semiHidden="1" w:uiPriority="39" w:unhideWhenUsed="1" w:qFormat="1"/>
-    <w:lsdException w:name="Plain Table 1" w:uiPriority="41"/>
-    <w:lsdException w:name="Plain Table 2" w:uiPriority="42"/>
-    <w:lsdException w:name="Plain Table 3" w:uiPriority="43"/>
-    <w:lsdException w:name="Plain Table 4" w:uiPriority="44"/>
-    <w:lsdException w:name="Plain Table 5" w:uiPriority="45"/>
-    <w:lsdException w:name="Grid Table Light" w:uiPriority="40"/>
-    <w:lsdException w:name="Grid Table 1 Light" w:uiPriority="46"/>
-    <w:lsdException w:name="Grid Table 2" w:uiPriority="47"/>
-    <w:lsdException w:name="Grid Table 3" w:uiPriority="48"/>
-    <w:lsdException w:name="Grid Table 4" w:uiPriority="49"/>
-    <w:lsdException w:name="Grid Table 5 Dark" w:uiPriority="50"/>
-    <w:lsdException w:name="Grid Table 6 Colorful" w:uiPriority="51"/>
-    <w:lsdException w:name="Grid Table 7 Colorful" w:uiPriority="52"/>
-    <w:lsdException w:name="Grid Table 1 Light Accent 1" w:uiPriority="46"/>
-    <w:lsdException w:name="Grid Table 2 Accent 1" w:uiPriority="47"/>
-    <w:lsdException w:name="Grid Table 3 Accent 1" w:uiPriority="48"/>
-    <w:lsdException w:name="Grid Table 4 Accent 1" w:uiPriority="49"/>
-    <w:lsdException w:name="Grid Table 5 Dark Accent 1" w:uiPriority="50"/>
-    <w:lsdException w:name="Grid Table 6 Colorful Accent 1" w:uiPriority="51"/>
-    <w:lsdException w:name="Grid Table 7 Colorful Accent 1" w:uiPriority="52"/>
-    <w:lsdException w:name="Grid Table 1 Light Accent 2" w:uiPriority="46"/>
-    <w:lsdException w:name="Grid Table 2 Accent 2" w:uiPriority="47"/>
-    <w:lsdException w:name="Grid Table 3 Accent 2" w:uiPriority="48"/>
-    <w:lsdException w:name="Grid Table 4 Accent 2" w:uiPriority="49"/>
-    <w:lsdException w:name="Grid Table 5 Dark Accent 2" w:uiPriority="50"/>
-    <w:lsdException w:name="Grid Table 6 Colorful Accent 2" w:uiPriority="51"/>
-    <w:lsdException w:name="Grid Table 7 Colorful Accent 2" w:uiPriority="52"/>
-    <w:lsdException w:name="Grid Table 1 Light Accent 3" w:uiPriority="46"/>
-    <w:lsdException w:name="Grid Table 2 Accent 3" w:uiPriority="47"/>
-    <w:lsdException w:name="Grid Table 3 Accent 3" w:uiPriority="48"/>
-    <w:lsdException w:name="Grid Table 4 Accent 3" w:uiPriority="49"/>
-    <w:lsdException w:name="Grid Table 5 Dark Accent 3" w:uiPriority="50"/>
-    <w:lsdException w:name="Grid Table 6 Colorful Accent 3" w:uiPriority="51"/>
-    <w:lsdException w:name="Grid Table 7 Colorful Accent 3" w:uiPriority="52"/>
-    <w:lsdException w:name="Grid Table 1 Light Accent 4" w:uiPriority="46"/>
-    <w:lsdException w:name="Grid Table 2 Accent 4" w:uiPriority="47"/>
-    <w:lsdException w:name="Grid Table 3 Accent 4" w:uiPriority="48"/>
-    <w:lsdException w:name="Grid Table 4 Accent 4" w:uiPriority="49"/>
-    <w:lsdException w:name="Grid Table 5 Dark Accent 4" w:uiPriority="50"/>
-    <w:lsdException w:name="Grid Table 6 Colorful Accent 4" w:uiPriority="51"/>
-    <w:lsdException w:name="Grid Table 7 Colorful Accent 4" w:uiPriority="52"/>
-    <w:lsdException w:name="Grid Table 1 Light Accent 5" w:uiPriority="46"/>
-    <w:lsdException w:name="Grid Table 2 Accent 5" w:uiPriority="47"/>
-    <w:lsdException w:name="Grid Table 3 Accent 5" w:uiPriority="48"/>
-    <w:lsdException w:name="Grid Table 4 Accent 5" w:uiPriority="49"/>
-    <w:lsdException w:name="Grid Table 5 Dark Accent 5" w:uiPriority="50"/>
-    <w:lsdException w:name="Grid Table 6 Colorful Accent 5" w:uiPriority="51"/>
-    <w:lsdException w:name="Grid Table 7 Colorful Accent 5" w:uiPriority="52"/>
-    <w:lsdException w:name="Grid Table 1 Light Accent 6" w:uiPriority="46"/>
-    <w:lsdException w:name="Grid Table 2 Accent 6" w:uiPriority="47"/>
-    <w:lsdException w:name="Grid Table 3 Accent 6" w:uiPriority="48"/>
-    <w:lsdException w:name="Grid Table 4 Accent 6" w:uiPriority="49"/>
-    <w:lsdException w:name="Grid Table 5 Dark Accent 6" w:uiPriority="50"/>
-    <w:lsdException w:name="Grid Table 6 Colorful Accent 6" w:uiPriority="51"/>
-    <w:lsdException w:name="Grid Table 7 Colorful Accent 6" w:uiPriority="52"/>
-    <w:lsdException w:name="List Table 1 Light" w:uiPriority="46"/>
-    <w:lsdException w:name="List Table 2" w:uiPriority="47"/>
-    <w:lsdException w:name="List Table 3" w:uiPriority="48"/>
-    <w:lsdException w:name="List Table 4" w:uiPriority="49"/>
-    <w:lsdException w:name="List Table 5 Dark" w:uiPriority="50"/>
-    <w:lsdException w:name="List Table 6 Colorful" w:uiPriority="51"/>
-    <w:lsdException w:name="List Table 7 Colorful" w:uiPriority="52"/>
-    <w:lsdException w:name="List Table 1 Light Accent 1" w:uiPriority="46"/>
-    <w:lsdException w:name="List Table 2 Accent 1" w:uiPriority="47"/>
-    <w:lsdException w:name="List Table 3 Accent 1" w:uiPriority="48"/>
-    <w:lsdException w:name="List Table 4 Accent 1" w:uiPriority="49"/>
-    <w:lsdException w:name="List Table 5 Dark Accent 1" w:uiPriority="50"/>
-    <w:lsdException w:name="List Table 6 Colorful Accent 1" w:uiPriority="51"/>
-    <w:lsdException w:name="List Table 7 Colorful Accent 1" w:uiPriority="52"/>
-    <w:lsdException w:name="List Table 1 Light Accent 2" w:uiPriority="46"/>
-    <w:lsdException w:name="List Table 2 Accent 2" w:uiPriority="47"/>
-    <w:lsdException w:name="List Table 3 Accent 2" w:uiPriority="48"/>
-    <w:lsdException w:name="List Table 4 Accent 2" w:uiPriority="49"/>
-    <w:lsdException w:name="List Table 5 Dark Accent 2" w:uiPriority="50"/>
-    <w:lsdException w:name="List Table 6 Colorful Accent 2" w:uiPriority="51"/>
-    <w:lsdException w:name="List Table 7 Colorful Accent 2" w:uiPriority="52"/>
-    <w:lsdException w:name="List Table 1 Light Accent 3" w:uiPriority="46"/>
-    <w:lsdException w:name="List Table 2 Accent 3" w:uiPriority="47"/>
-    <w:lsdException w:name="List Table 3 Accent 3" w:uiPriority="48"/>
-    <w:lsdException w:name="List Table 4 Accent 3" w:uiPriority="49"/>
-    <w:lsdException w:name="List Table 5 Dark Accent 3" w:uiPriority="50"/>
-    <w:lsdException w:name="List Table 6 Colorful Accent 3" w:uiPriority="51"/>
-    <w:lsdException w:name="List Table 7 Colorful Accent 3" w:uiPriority="52"/>
-    <w:lsdException w:name="List Table 1 Light Accent 4" w:uiPriority="46"/>
-    <w:lsdException w:name="List Table 2 Accent 4" w:uiPriority="47"/>
-    <w:lsdException w:name="List Table 3 Accent 4" w:uiPriority="48"/>
-    <w:lsdException w:name="List Table 4 Accent 4" w:uiPriority="49"/>
-    <w:lsdException w:name="List Table 5 Dark Accent 4" w:uiPriority="50"/>
-    <w:lsdException w:name="List Table 6 Colorful Accent 4" w:uiPriority="51"/>
-    <w:lsdException w:name="List Table 7 Colorful Accent 4" w:uiPriority="52"/>
-    <w:lsdException w:name="List Table 1 Light Accent 5" w:uiPriority="46"/>
-    <w:lsdException w:name="List Table 2 Accent 5" w:uiPriority="47"/>
-    <w:lsdException w:name="List Table 3 Accent 5" w:uiPriority="48"/>
-    <w:lsdException w:name="List Table 4 Accent 5" w:uiPriority="49"/>
-    <w:lsdException w:name="List Table 5 Dark Accent 5" w:uiPriority="50"/>
-    <w:lsdException w:name="List Table 6 Colorful Accent 5" w:uiPriority="51"/>
-    <w:lsdException w:name="List Table 7 Colorful Accent 5" w:uiPriority="52"/>
-    <w:lsdException w:name="List Table 1 Light Accent 6" w:uiPriority="46"/>
-    <w:lsdException w:name="List Table 2 Accent 6" w:uiPriority="47"/>
-    <w:lsdException w:name="List Table 3 Accent 6" w:uiPriority="48"/>
-    <w:lsdException w:name="List Table 4 Accent 6" w:uiPriority="49"/>
-    <w:lsdException w:name="List Table 5 Dark Accent 6" w:uiPriority="50"/>
-    <w:lsdException w:name="List Table 6 Colorful Accent 6" w:uiPriority="51"/>
-    <w:lsdException w:name="List Table 7 Colorful Accent 6" w:uiPriority="52"/>
-  </w:latentStyles>
-  <w:style w:type="paragraph" w:default="1" w:styleId="Normal">
-    <w:name w:val="Normal"/>
-    <w:qFormat/>
-  </w:style>
-  <w:style w:type="character" w:default="1" w:styleId="Fuentedeprrafopredeter">
-    <w:name w:val="Default Paragraph Font"/>
-    <w:uiPriority w:val="1"/>
-    <w:semiHidden/>
-    <w:unhideWhenUsed/>
-  </w:style>
-  <w:style w:type="table" w:default="1" w:styleId="Tablanormal">
-    <w:name w:val="Normal Table"/>
-    <w:uiPriority w:val="99"/>
-    <w:semiHidden/>
-    <w:unhideWhenUsed/>
-    <w:tblPr>
-      <w:tblInd w:w="0" w:type="dxa"/>
-      <w:tblCellMar>
-        <w:top w:w="0" w:type="dxa"/>
-        <w:left w:w="108" w:type="dxa"/>
-        <w:bottom w:w="0" w:type="dxa"/>
-        <w:right w:w="108" w:type="dxa"/>
-      </w:tblCellMar>
-    </w:tblPr>
-  </w:style>
-  <w:style w:type="numbering" w:default="1" w:styleId="Sinlista">
-    <w:name w:val="No List"/>
-    <w:uiPriority w:val="99"/>
-    <w:semiHidden/>
-    <w:unhideWhenUsed/>
-  </w:style>
-</w:styles>
-</file>
-
-<file path=word/glossary/webSettings.xml><?xml version="1.0" encoding="utf-8"?>
-<w:webSettings xmlns:mc="http://schemas.openxmlformats.org/markup-compatibility/2006" xmlns:r="http://schemas.openxmlformats.org/officeDocument/2006/relationships" xmlns:w="http://schemas.openxmlformats.org/wordprocessingml/2006/main" xmlns:w14="http://schemas.microsoft.com/office/word/2010/wordml" xmlns:w15="http://schemas.microsoft.com/office/word/2012/wordml" xmlns:w16se="http://schemas.microsoft.com/office/word/2015/wordml/symex" mc:Ignorable="w14 w15 w16se"/>
 </file>
 
 <file path=word/theme/theme1.xml><?xml version="1.0" encoding="utf-8"?>
@@ -8852,12 +8638,9 @@
 </file>
 
 <file path=customXml/item1.xml><?xml version="1.0" encoding="utf-8"?>
-<?mso-contentType ?>
-<FormTemplates xmlns="http://schemas.microsoft.com/sharepoint/v3/contenttype/forms">
-  <Display>DocumentLibraryForm</Display>
-  <Edit>DocumentLibraryForm</Edit>
-  <New>DocumentLibraryForm</New>
-</FormTemplates>
+<p:properties xmlns:p="http://schemas.microsoft.com/office/2006/metadata/properties" xmlns:xsi="http://www.w3.org/2001/XMLSchema-instance" xmlns:pc="http://schemas.microsoft.com/office/infopath/2007/PartnerControls">
+  <documentManagement/>
+</p:properties>
 </file>
 
 <file path=customXml/item2.xml><?xml version="1.0" encoding="utf-8"?>
@@ -8993,9 +8776,12 @@
 </file>
 
 <file path=customXml/item3.xml><?xml version="1.0" encoding="utf-8"?>
-<p:properties xmlns:p="http://schemas.microsoft.com/office/2006/metadata/properties" xmlns:xsi="http://www.w3.org/2001/XMLSchema-instance" xmlns:pc="http://schemas.microsoft.com/office/infopath/2007/PartnerControls">
-  <documentManagement/>
-</p:properties>
+<?mso-contentType ?>
+<FormTemplates xmlns="http://schemas.microsoft.com/sharepoint/v3/contenttype/forms">
+  <Display>DocumentLibraryForm</Display>
+  <Edit>DocumentLibraryForm</Edit>
+  <New>DocumentLibraryForm</New>
+</FormTemplates>
 </file>
 
 <file path=customXml/item4.xml><?xml version="1.0" encoding="utf-8"?>
@@ -9003,9 +8789,10 @@
 </file>
 
 <file path=customXml/itemProps1.xml><?xml version="1.0" encoding="utf-8"?>
-<ds:datastoreItem xmlns:ds="http://schemas.openxmlformats.org/officeDocument/2006/customXml" ds:itemID="{DABAA964-10BA-4DBC-ABF2-CDEAC0FAF7AA}">
+<ds:datastoreItem xmlns:ds="http://schemas.openxmlformats.org/officeDocument/2006/customXml" ds:itemID="{5F1783E3-BA1C-4CA3-8E32-C9B378BBED03}">
   <ds:schemaRefs>
-    <ds:schemaRef ds:uri="http://schemas.microsoft.com/sharepoint/v3/contenttype/forms"/>
+    <ds:schemaRef ds:uri="http://schemas.microsoft.com/office/2006/metadata/properties"/>
+    <ds:schemaRef ds:uri="http://schemas.microsoft.com/office/infopath/2007/PartnerControls"/>
   </ds:schemaRefs>
 </ds:datastoreItem>
 </file>
@@ -9029,17 +8816,9 @@
 </file>
 
 <file path=customXml/itemProps3.xml><?xml version="1.0" encoding="utf-8"?>
-<ds:datastoreItem xmlns:ds="http://schemas.openxmlformats.org/officeDocument/2006/customXml" ds:itemID="{5F1783E3-BA1C-4CA3-8E32-C9B378BBED03}">
+<ds:datastoreItem xmlns:ds="http://schemas.openxmlformats.org/officeDocument/2006/customXml" ds:itemID="{DABAA964-10BA-4DBC-ABF2-CDEAC0FAF7AA}">
   <ds:schemaRefs>
-    <ds:schemaRef ds:uri="http://purl.org/dc/terms/"/>
-    <ds:schemaRef ds:uri="http://schemas.microsoft.com/office/2006/metadata/properties"/>
-    <ds:schemaRef ds:uri="http://schemas.openxmlformats.org/package/2006/metadata/core-properties"/>
-    <ds:schemaRef ds:uri="http://schemas.microsoft.com/office/infopath/2007/PartnerControls"/>
-    <ds:schemaRef ds:uri="http://www.w3.org/XML/1998/namespace"/>
-    <ds:schemaRef ds:uri="http://schemas.microsoft.com/office/2006/documentManagement/types"/>
-    <ds:schemaRef ds:uri="http://purl.org/dc/elements/1.1/"/>
-    <ds:schemaRef ds:uri="126e8a1c-9ea9-435a-ac89-d06c80d62e30"/>
-    <ds:schemaRef ds:uri="http://purl.org/dc/dcmitype/"/>
+    <ds:schemaRef ds:uri="http://schemas.microsoft.com/sharepoint/v3/contenttype/forms"/>
   </ds:schemaRefs>
 </ds:datastoreItem>
 </file>

</xml_diff>